<commit_message>
Modified mirrored headers and footers.
</commit_message>
<xml_diff>
--- a/BuildingBlocks_ConfigurationFile/Files/BB_ms_BB_Content.docx
+++ b/BuildingBlocks_ConfigurationFile/Files/BB_ms_BB_Content.docx
@@ -1,7 +1,6 @@
 
 <file path=word/document.xml><?xml version="1.0" encoding="utf-8"?>
 <w:document xmlns:wpc="http://schemas.microsoft.com/office/word/2010/wordprocessingCanvas" xmlns:cx="http://schemas.microsoft.com/office/drawing/2014/chartex" xmlns:cx1="http://schemas.microsoft.com/office/drawing/2015/9/8/chartex" xmlns:cx2="http://schemas.microsoft.com/office/drawing/2015/10/21/chartex" xmlns:cx3="http://schemas.microsoft.com/office/drawing/2016/5/9/chartex" xmlns:cx4="http://schemas.microsoft.com/office/drawing/2016/5/10/chartex" xmlns:cx5="http://schemas.microsoft.com/office/drawing/2016/5/11/chartex" xmlns:cx6="http://schemas.microsoft.com/office/drawing/2016/5/12/chartex" xmlns:cx7="http://schemas.microsoft.com/office/drawing/2016/5/13/chartex" xmlns:cx8="http://schemas.microsoft.com/office/drawing/2016/5/14/chartex" xmlns:mc="http://schemas.openxmlformats.org/markup-compatibility/2006" xmlns:aink="http://schemas.microsoft.com/office/drawing/2016/ink" xmlns:am3d="http://schemas.microsoft.com/office/drawing/2017/model3d" xmlns:o="urn:schemas-microsoft-com:office:office" xmlns:oel="http://schemas.microsoft.com/office/2019/extlst" xmlns:r="http://schemas.openxmlformats.org/officeDocument/2006/relationships" xmlns:m="http://schemas.openxmlformats.org/officeDocument/2006/math" xmlns:v="urn:schemas-microsoft-com:vml" xmlns:wp14="http://schemas.microsoft.com/office/word/2010/wordprocessingDrawing" xmlns:wp="http://schemas.openxmlformats.org/drawingml/2006/wordprocessingDrawing" xmlns:w10="urn:schemas-microsoft-com:office:word" xmlns:w="http://schemas.openxmlformats.org/wordprocessingml/2006/main" xmlns:w14="http://schemas.microsoft.com/office/word/2010/wordml" xmlns:w15="http://schemas.microsoft.com/office/word/2012/wordml" xmlns:w16cex="http://schemas.microsoft.com/office/word/2018/wordml/cex" xmlns:w16cid="http://schemas.microsoft.com/office/word/2016/wordml/cid" xmlns:w16="http://schemas.microsoft.com/office/word/2018/wordml" xmlns:w16du="http://schemas.microsoft.com/office/word/2023/wordml/word16du" xmlns:w16sdtdh="http://schemas.microsoft.com/office/word/2020/wordml/sdtdatahash" xmlns:w16sdtfl="http://schemas.microsoft.com/office/word/2024/wordml/sdtformatlock" xmlns:w16se="http://schemas.microsoft.com/office/word/2015/wordml/symex" xmlns:wpg="http://schemas.microsoft.com/office/word/2010/wordprocessingGroup" xmlns:wpi="http://schemas.microsoft.com/office/word/2010/wordprocessingInk" xmlns:wne="http://schemas.microsoft.com/office/word/2006/wordml" xmlns:wps="http://schemas.microsoft.com/office/word/2010/wordprocessingShape" mc:Ignorable="w14 w15 w16se w16cid w16 w16cex w16sdtdh w16sdtfl w16du wp14">
-  <w:background w:color="DBDBDB"/>
   <w:body>
     <w:p>
       <w:pPr>
@@ -2250,7 +2249,6 @@
           <w:color w:val="CCCCCC"/>
           <w:lang w:eastAsia="pl-PL"/>
         </w:rPr>
-        <w:lastRenderedPageBreak/>
         <w:t>     </w:t>
       </w:r>
       <w:r>
@@ -3684,8 +3682,8 @@
         <w:pStyle w:val="ParListHeadingms"/>
       </w:pPr>
       <w:bookmarkStart w:id="4" w:name="_Toc140141395"/>
-      <w:bookmarkStart w:id="5" w:name="_Toc220266740"/>
-      <w:bookmarkStart w:id="6" w:name="_Toc220266752"/>
+      <w:bookmarkStart w:id="5" w:name="_Toc221960863"/>
+      <w:bookmarkStart w:id="6" w:name="_Toc221960875"/>
       <w:r>
         <w:t>List of symbols and icons</w:t>
       </w:r>
@@ -4629,8 +4627,8 @@
       <w:pPr>
         <w:pStyle w:val="ParListHeadingms"/>
       </w:pPr>
-      <w:bookmarkStart w:id="10" w:name="_Toc220266741"/>
-      <w:bookmarkStart w:id="11" w:name="_Toc220266753"/>
+      <w:bookmarkStart w:id="10" w:name="_Toc221960864"/>
+      <w:bookmarkStart w:id="11" w:name="_Toc221960876"/>
       <w:r>
         <w:t>List of acronyms</w:t>
       </w:r>
@@ -4834,7 +4832,6 @@
         <w:pStyle w:val="ParLegendTablems"/>
       </w:pPr>
       <w:r>
-        <w:lastRenderedPageBreak/>
         <w:t>Tab. </w:t>
       </w:r>
       <w:r>
@@ -5391,7 +5388,6 @@
         <w:rPr>
           <w:noProof/>
         </w:rPr>
-        <w:lastRenderedPageBreak/>
         <mc:AlternateContent>
           <mc:Choice Requires="wpc">
             <w:drawing>
@@ -5636,8 +5632,8 @@
       <w:pPr>
         <w:pStyle w:val="ParListHeadingms"/>
       </w:pPr>
-      <w:bookmarkStart w:id="19" w:name="_Toc220266742"/>
-      <w:bookmarkStart w:id="20" w:name="_Toc220266754"/>
+      <w:bookmarkStart w:id="19" w:name="_Toc221960865"/>
+      <w:bookmarkStart w:id="20" w:name="_Toc221960877"/>
       <w:r>
         <w:t>List of Content</w:t>
       </w:r>
@@ -5722,7 +5718,7 @@
         </w:rPr>
         <w:fldChar w:fldCharType="separate"/>
       </w:r>
-      <w:hyperlink w:anchor="_Toc220266740" w:history="1">
+      <w:hyperlink w:anchor="_Toc221960863" w:history="1">
         <w:r>
           <w:rPr>
             <w:rStyle w:val="Hyperlink"/>
@@ -5749,7 +5745,7 @@
             <w:noProof/>
             <w:webHidden/>
           </w:rPr>
-          <w:instrText xml:space="preserve"> PAGEREF _Toc220266740 \h </w:instrText>
+          <w:instrText xml:space="preserve"> PAGEREF _Toc221960863 \h </w:instrText>
         </w:r>
         <w:r>
           <w:rPr>
@@ -5795,7 +5791,7 @@
           <w:lang w:val="pl-PL" w:eastAsia="pl-PL"/>
         </w:rPr>
       </w:pPr>
-      <w:hyperlink w:anchor="_Toc220266741" w:history="1">
+      <w:hyperlink w:anchor="_Toc221960864" w:history="1">
         <w:r>
           <w:rPr>
             <w:rStyle w:val="Hyperlink"/>
@@ -5822,7 +5818,7 @@
             <w:noProof/>
             <w:webHidden/>
           </w:rPr>
-          <w:instrText xml:space="preserve"> PAGEREF _Toc220266741 \h </w:instrText>
+          <w:instrText xml:space="preserve"> PAGEREF _Toc221960864 \h </w:instrText>
         </w:r>
         <w:r>
           <w:rPr>
@@ -5868,7 +5864,7 @@
           <w:lang w:val="pl-PL" w:eastAsia="pl-PL"/>
         </w:rPr>
       </w:pPr>
-      <w:hyperlink w:anchor="_Toc220266742" w:history="1">
+      <w:hyperlink w:anchor="_Toc221960865" w:history="1">
         <w:r>
           <w:rPr>
             <w:rStyle w:val="Hyperlink"/>
@@ -5895,7 +5891,7 @@
             <w:noProof/>
             <w:webHidden/>
           </w:rPr>
-          <w:instrText xml:space="preserve"> PAGEREF _Toc220266742 \h </w:instrText>
+          <w:instrText xml:space="preserve"> PAGEREF _Toc221960865 \h </w:instrText>
         </w:r>
         <w:r>
           <w:rPr>
@@ -5941,7 +5937,7 @@
           <w:lang w:val="pl-PL" w:eastAsia="pl-PL"/>
         </w:rPr>
       </w:pPr>
-      <w:hyperlink w:anchor="_Toc220266743" w:history="1">
+      <w:hyperlink w:anchor="_Toc221960866" w:history="1">
         <w:r>
           <w:rPr>
             <w:rStyle w:val="Hyperlink"/>
@@ -5968,7 +5964,7 @@
             <w:noProof/>
             <w:webHidden/>
           </w:rPr>
-          <w:instrText xml:space="preserve"> PAGEREF _Toc220266743 \h </w:instrText>
+          <w:instrText xml:space="preserve"> PAGEREF _Toc221960866 \h </w:instrText>
         </w:r>
         <w:r>
           <w:rPr>
@@ -6014,7 +6010,7 @@
           <w:lang w:val="pl-PL" w:eastAsia="pl-PL"/>
         </w:rPr>
       </w:pPr>
-      <w:hyperlink w:anchor="_Toc220266744" w:history="1">
+      <w:hyperlink w:anchor="_Toc221960867" w:history="1">
         <w:r>
           <w:rPr>
             <w:rStyle w:val="Hyperlink"/>
@@ -6041,7 +6037,7 @@
             <w:noProof/>
             <w:webHidden/>
           </w:rPr>
-          <w:instrText xml:space="preserve"> PAGEREF _Toc220266744 \h </w:instrText>
+          <w:instrText xml:space="preserve"> PAGEREF _Toc221960867 \h </w:instrText>
         </w:r>
         <w:r>
           <w:rPr>
@@ -6087,7 +6083,7 @@
           <w:lang w:val="pl-PL" w:eastAsia="pl-PL"/>
         </w:rPr>
       </w:pPr>
-      <w:hyperlink w:anchor="_Toc220266745" w:history="1">
+      <w:hyperlink w:anchor="_Toc221960868" w:history="1">
         <w:r>
           <w:rPr>
             <w:rStyle w:val="Hyperlink"/>
@@ -6114,7 +6110,7 @@
             <w:noProof/>
             <w:webHidden/>
           </w:rPr>
-          <w:instrText xml:space="preserve"> PAGEREF _Toc220266745 \h </w:instrText>
+          <w:instrText xml:space="preserve"> PAGEREF _Toc221960868 \h </w:instrText>
         </w:r>
         <w:r>
           <w:rPr>
@@ -6160,7 +6156,7 @@
           <w:lang w:val="pl-PL" w:eastAsia="pl-PL"/>
         </w:rPr>
       </w:pPr>
-      <w:hyperlink w:anchor="_Toc220266746" w:history="1">
+      <w:hyperlink w:anchor="_Toc221960869" w:history="1">
         <w:r>
           <w:rPr>
             <w:rStyle w:val="Hyperlink"/>
@@ -6187,7 +6183,7 @@
             <w:noProof/>
             <w:webHidden/>
           </w:rPr>
-          <w:instrText xml:space="preserve"> PAGEREF _Toc220266746 \h </w:instrText>
+          <w:instrText xml:space="preserve"> PAGEREF _Toc221960869 \h </w:instrText>
         </w:r>
         <w:r>
           <w:rPr>
@@ -6233,7 +6229,7 @@
           <w:lang w:val="pl-PL" w:eastAsia="pl-PL"/>
         </w:rPr>
       </w:pPr>
-      <w:hyperlink w:anchor="_Toc220266747" w:history="1">
+      <w:hyperlink w:anchor="_Toc221960870" w:history="1">
         <w:r>
           <w:rPr>
             <w:rStyle w:val="Hyperlink"/>
@@ -6260,7 +6256,7 @@
             <w:noProof/>
             <w:webHidden/>
           </w:rPr>
-          <w:instrText xml:space="preserve"> PAGEREF _Toc220266747 \h </w:instrText>
+          <w:instrText xml:space="preserve"> PAGEREF _Toc221960870 \h </w:instrText>
         </w:r>
         <w:r>
           <w:rPr>
@@ -6306,7 +6302,7 @@
           <w:lang w:val="pl-PL" w:eastAsia="pl-PL"/>
         </w:rPr>
       </w:pPr>
-      <w:hyperlink w:anchor="_Toc220266748" w:history="1">
+      <w:hyperlink w:anchor="_Toc221960871" w:history="1">
         <w:r>
           <w:rPr>
             <w:rStyle w:val="Hyperlink"/>
@@ -6333,7 +6329,7 @@
             <w:noProof/>
             <w:webHidden/>
           </w:rPr>
-          <w:instrText xml:space="preserve"> PAGEREF _Toc220266748 \h </w:instrText>
+          <w:instrText xml:space="preserve"> PAGEREF _Toc221960871 \h </w:instrText>
         </w:r>
         <w:r>
           <w:rPr>
@@ -6379,7 +6375,7 @@
           <w:lang w:val="pl-PL" w:eastAsia="pl-PL"/>
         </w:rPr>
       </w:pPr>
-      <w:hyperlink w:anchor="_Toc220266749" w:history="1">
+      <w:hyperlink w:anchor="_Toc221960872" w:history="1">
         <w:r>
           <w:rPr>
             <w:rStyle w:val="Hyperlink"/>
@@ -6406,7 +6402,7 @@
             <w:noProof/>
             <w:webHidden/>
           </w:rPr>
-          <w:instrText xml:space="preserve"> PAGEREF _Toc220266749 \h </w:instrText>
+          <w:instrText xml:space="preserve"> PAGEREF _Toc221960872 \h </w:instrText>
         </w:r>
         <w:r>
           <w:rPr>
@@ -6426,7 +6422,7 @@
             <w:noProof/>
             <w:webHidden/>
           </w:rPr>
-          <w:t>11</w:t>
+          <w:t>12</w:t>
         </w:r>
         <w:r>
           <w:rPr>
@@ -6452,7 +6448,7 @@
           <w:lang w:val="pl-PL" w:eastAsia="pl-PL"/>
         </w:rPr>
       </w:pPr>
-      <w:hyperlink w:anchor="_Toc220266750" w:history="1">
+      <w:hyperlink w:anchor="_Toc221960873" w:history="1">
         <w:r>
           <w:rPr>
             <w:rStyle w:val="Hyperlink"/>
@@ -6479,7 +6475,7 @@
             <w:noProof/>
             <w:webHidden/>
           </w:rPr>
-          <w:instrText xml:space="preserve"> PAGEREF _Toc220266750 \h </w:instrText>
+          <w:instrText xml:space="preserve"> PAGEREF _Toc221960873 \h </w:instrText>
         </w:r>
         <w:r>
           <w:rPr>
@@ -6499,7 +6495,7 @@
             <w:noProof/>
             <w:webHidden/>
           </w:rPr>
-          <w:t>13</w:t>
+          <w:t>14</w:t>
         </w:r>
         <w:r>
           <w:rPr>
@@ -6525,7 +6521,7 @@
           <w:lang w:val="pl-PL" w:eastAsia="pl-PL"/>
         </w:rPr>
       </w:pPr>
-      <w:hyperlink w:anchor="_Toc220266751" w:history="1">
+      <w:hyperlink w:anchor="_Toc221960874" w:history="1">
         <w:r>
           <w:rPr>
             <w:rStyle w:val="Hyperlink"/>
@@ -6552,7 +6548,7 @@
             <w:noProof/>
             <w:webHidden/>
           </w:rPr>
-          <w:instrText xml:space="preserve"> PAGEREF _Toc220266751 \h </w:instrText>
+          <w:instrText xml:space="preserve"> PAGEREF _Toc221960874 \h </w:instrText>
         </w:r>
         <w:r>
           <w:rPr>
@@ -6572,7 +6568,7 @@
             <w:noProof/>
             <w:webHidden/>
           </w:rPr>
-          <w:t>14</w:t>
+          <w:t>15</w:t>
         </w:r>
         <w:r>
           <w:rPr>
@@ -6638,7 +6634,6 @@
         <w:pStyle w:val="ParNormalms"/>
       </w:pPr>
       <w:r>
-        <w:lastRenderedPageBreak/>
         <w:t>&lt;bb_description&gt;”ParListHeading ms” + {</w:t>
       </w:r>
       <w:r>
@@ -6701,8 +6696,8 @@
         <w:t xml:space="preserve">&lt;bb_insertoptions&gt;wdInsertContent </w:t>
       </w:r>
     </w:p>
-    <w:bookmarkStart w:id="21" w:name="_Toc220266755" w:displacedByCustomXml="next"/>
-    <w:bookmarkStart w:id="22" w:name="_Toc220266743" w:displacedByCustomXml="next"/>
+    <w:bookmarkStart w:id="21" w:name="_Toc221960878" w:displacedByCustomXml="next"/>
+    <w:bookmarkStart w:id="22" w:name="_Toc221960866" w:displacedByCustomXml="next"/>
     <w:sdt>
       <w:sdtPr>
         <w:rPr>
@@ -7627,8 +7622,8 @@
       <w:pPr>
         <w:pStyle w:val="ParListHeadingms"/>
       </w:pPr>
-      <w:bookmarkStart w:id="23" w:name="_Toc220266744"/>
-      <w:bookmarkStart w:id="24" w:name="_Toc220266756"/>
+      <w:bookmarkStart w:id="23" w:name="_Toc221960867"/>
+      <w:bookmarkStart w:id="24" w:name="_Toc221960879"/>
       <w:r>
         <w:t>Change log</w:t>
       </w:r>
@@ -7981,8 +7976,8 @@
         <w:t>&lt;bb_insertoptions&gt;wdInsertContent</w:t>
       </w:r>
     </w:p>
-    <w:bookmarkStart w:id="25" w:name="_Toc220266757" w:displacedByCustomXml="next"/>
-    <w:bookmarkStart w:id="26" w:name="_Toc220266745" w:displacedByCustomXml="next"/>
+    <w:bookmarkStart w:id="25" w:name="_Toc221960880" w:displacedByCustomXml="next"/>
+    <w:bookmarkStart w:id="26" w:name="_Toc221960868" w:displacedByCustomXml="next"/>
     <w:sdt>
       <w:sdtPr>
         <w:rPr>
@@ -8019,10 +8014,10 @@
           <w:r>
             <w:t>ures</w:t>
           </w:r>
+          <w:bookmarkEnd w:id="26"/>
+          <w:bookmarkEnd w:id="25"/>
           <w:bookmarkEnd w:id="28"/>
           <w:bookmarkEnd w:id="27"/>
-          <w:bookmarkEnd w:id="26"/>
-          <w:bookmarkEnd w:id="25"/>
         </w:p>
         <w:p>
           <w:pPr>
@@ -8111,7 +8106,6 @@
         <w:pStyle w:val="ParNormalms"/>
       </w:pPr>
       <w:r>
-        <w:lastRenderedPageBreak/>
         <w:t xml:space="preserve">&lt;bb_description&gt;List header: “ParListHeading ms” + </w:t>
       </w:r>
       <w:r>
@@ -8145,8 +8139,8 @@
       <w:pPr>
         <w:pStyle w:val="ParListHeadingms"/>
       </w:pPr>
-      <w:bookmarkStart w:id="29" w:name="_Toc220266746"/>
-      <w:bookmarkStart w:id="30" w:name="_Toc220266758"/>
+      <w:bookmarkStart w:id="29" w:name="_Toc221960869"/>
+      <w:bookmarkStart w:id="30" w:name="_Toc221960881"/>
       <w:r>
         <w:t>List of Tables</w:t>
       </w:r>
@@ -8280,8 +8274,8 @@
       <w:pPr>
         <w:pStyle w:val="ParListHeadingms"/>
       </w:pPr>
-      <w:bookmarkStart w:id="33" w:name="_Toc220266747"/>
-      <w:bookmarkStart w:id="34" w:name="_Toc220266759"/>
+      <w:bookmarkStart w:id="33" w:name="_Toc221960870"/>
+      <w:bookmarkStart w:id="34" w:name="_Toc221960882"/>
       <w:r>
         <w:t xml:space="preserve">List of </w:t>
       </w:r>
@@ -8419,8 +8413,8 @@
       <w:pPr>
         <w:pStyle w:val="ParListHeadingms"/>
       </w:pPr>
-      <w:bookmarkStart w:id="35" w:name="_Toc220266748"/>
-      <w:bookmarkStart w:id="36" w:name="_Toc220266760"/>
+      <w:bookmarkStart w:id="35" w:name="_Toc221960871"/>
+      <w:bookmarkStart w:id="36" w:name="_Toc221960883"/>
       <w:r>
         <w:t>List of Tables</w:t>
       </w:r>
@@ -8648,6 +8642,357 @@
             <w:r>
               <w:rPr>
                 <w:rStyle w:val="CharDefaultms"/>
+              </w:rPr>
+              <w:fldChar w:fldCharType="end"/>
+            </w:r>
+          </w:p>
+        </w:tc>
+      </w:tr>
+    </w:tbl>
+    <w:p>
+      <w:pPr>
+        <w:pStyle w:val="ParMinimalms"/>
+      </w:pPr>
+    </w:p>
+    <w:p>
+      <w:pPr>
+        <w:pStyle w:val="ParNormalms"/>
+      </w:pPr>
+    </w:p>
+    <w:p>
+      <w:pPr>
+        <w:pStyle w:val="ParNormalms"/>
+      </w:pPr>
+      <w:r>
+        <w:t>&lt;bb_name&gt;</w:t>
+      </w:r>
+      <w:r>
+        <w:t>Header</w:t>
+      </w:r>
+      <w:r>
+        <w:t>Wide</w:t>
+      </w:r>
+      <w:r>
+        <w:t>Left</w:t>
+      </w:r>
+    </w:p>
+    <w:p>
+      <w:pPr>
+        <w:pStyle w:val="ParNormalms"/>
+      </w:pPr>
+      <w:r>
+        <w:t xml:space="preserve">&lt;bb_type&gt; wdTypeHeaders </w:t>
+      </w:r>
+    </w:p>
+    <w:p>
+      <w:pPr>
+        <w:pStyle w:val="ParNormalms"/>
+      </w:pPr>
+      <w:r>
+        <w:t>&lt;bb_category&gt;General</w:t>
+      </w:r>
+    </w:p>
+    <w:p>
+      <w:pPr>
+        <w:pStyle w:val="ParNormalms"/>
+      </w:pPr>
+      <w:r>
+        <w:t>&lt;bb_description&gt;</w:t>
+      </w:r>
+      <w:r>
+        <w:t>Wid</w:t>
+      </w:r>
+      <w:r>
+        <w:t>er header</w:t>
+      </w:r>
+      <w:r>
+        <w:t xml:space="preserve">, as in </w:t>
+      </w:r>
+      <w:r>
+        <w:t xml:space="preserve">a </w:t>
+      </w:r>
+      <w:r>
+        <w:t>book</w:t>
+      </w:r>
+    </w:p>
+    <w:p>
+      <w:pPr>
+        <w:pStyle w:val="ParNormalms"/>
+      </w:pPr>
+      <w:r>
+        <w:t xml:space="preserve">&lt;bb_insertoptions&gt;wdInsertContent </w:t>
+      </w:r>
+    </w:p>
+    <w:tbl>
+      <w:tblPr>
+        <w:tblStyle w:val="TableGrid"/>
+        <w:tblW w:w="10773" w:type="dxa"/>
+        <w:tblInd w:w="-397" w:type="dxa"/>
+        <w:tblLook w:val="04A0" w:firstRow="1" w:lastRow="0" w:firstColumn="1" w:lastColumn="0" w:noHBand="0" w:noVBand="1"/>
+      </w:tblPr>
+      <w:tblGrid>
+        <w:gridCol w:w="3591"/>
+        <w:gridCol w:w="3591"/>
+        <w:gridCol w:w="3591"/>
+      </w:tblGrid>
+      <w:tr>
+        <w:trPr>
+          <w:cnfStyle w:val="100000000000" w:firstRow="1" w:lastRow="0" w:firstColumn="0" w:lastColumn="0" w:oddVBand="0" w:evenVBand="0" w:oddHBand="0" w:evenHBand="0" w:firstRowFirstColumn="0" w:firstRowLastColumn="0" w:lastRowFirstColumn="0" w:lastRowLastColumn="0"/>
+          <w:trHeight w:hRule="exact" w:val="284"/>
+        </w:trPr>
+        <w:tc>
+          <w:tcPr>
+            <w:tcW w:w="3326" w:type="dxa"/>
+            <w:tcBorders>
+              <w:bottom w:val="single" w:sz="8" w:space="0" w:color="00B050"/>
+            </w:tcBorders>
+            <w:tcMar>
+              <w:left w:w="0" w:type="dxa"/>
+              <w:right w:w="0" w:type="dxa"/>
+            </w:tcMar>
+            <w:vAlign w:val="top"/>
+          </w:tcPr>
+          <w:p>
+            <w:pPr>
+              <w:pStyle w:val="ParNormalms"/>
+            </w:pPr>
+            <w:fldSimple w:instr=" AUTHOR   \* MERGEFORMAT ">
+              <w:r>
+                <w:rPr>
+                  <w:noProof/>
+                </w:rPr>
+                <w:t>Maciej Słojewski</w:t>
+              </w:r>
+            </w:fldSimple>
+          </w:p>
+        </w:tc>
+        <w:tc>
+          <w:tcPr>
+            <w:tcW w:w="3327" w:type="dxa"/>
+            <w:tcBorders>
+              <w:bottom w:val="single" w:sz="8" w:space="0" w:color="00B050"/>
+            </w:tcBorders>
+            <w:tcMar>
+              <w:left w:w="0" w:type="dxa"/>
+              <w:right w:w="0" w:type="dxa"/>
+            </w:tcMar>
+            <w:vAlign w:val="top"/>
+          </w:tcPr>
+          <w:p>
+            <w:pPr>
+              <w:pStyle w:val="ParNormalms"/>
+              <w:jc w:val="center"/>
+            </w:pPr>
+            <w:fldSimple w:instr=" DOCPROPERTY  ms_DocumentTitle1  \* MERGEFORMAT ">
+              <w:r>
+                <w:t>product / system short name</w:t>
+              </w:r>
+            </w:fldSimple>
+          </w:p>
+        </w:tc>
+        <w:tc>
+          <w:tcPr>
+            <w:tcW w:w="3327" w:type="dxa"/>
+            <w:tcBorders>
+              <w:bottom w:val="single" w:sz="8" w:space="0" w:color="00B050"/>
+            </w:tcBorders>
+            <w:tcMar>
+              <w:left w:w="0" w:type="dxa"/>
+              <w:right w:w="0" w:type="dxa"/>
+            </w:tcMar>
+            <w:vAlign w:val="top"/>
+          </w:tcPr>
+          <w:p>
+            <w:pPr>
+              <w:pStyle w:val="ParNormalms"/>
+              <w:jc w:val="right"/>
+            </w:pPr>
+            <w:fldSimple w:instr=" DOCPROPERTY  ms_DocumentTitle2  \* MERGEFORMAT ">
+              <w:r>
+                <w:t>product / system full name</w:t>
+              </w:r>
+            </w:fldSimple>
+          </w:p>
+        </w:tc>
+      </w:tr>
+    </w:tbl>
+    <w:p>
+      <w:pPr>
+        <w:pStyle w:val="ParMinimalms"/>
+      </w:pPr>
+    </w:p>
+    <w:p>
+      <w:pPr>
+        <w:pStyle w:val="ParNormalms"/>
+      </w:pPr>
+    </w:p>
+    <w:p>
+      <w:pPr>
+        <w:pStyle w:val="ParNormalms"/>
+      </w:pPr>
+    </w:p>
+    <w:p>
+      <w:pPr>
+        <w:pStyle w:val="ParNormalms"/>
+      </w:pPr>
+      <w:r>
+        <w:t>&lt;bb_name&gt;HeaderWide</w:t>
+      </w:r>
+      <w:r>
+        <w:t>Right</w:t>
+      </w:r>
+    </w:p>
+    <w:p>
+      <w:pPr>
+        <w:pStyle w:val="ParNormalms"/>
+      </w:pPr>
+      <w:r>
+        <w:t xml:space="preserve">&lt;bb_type&gt; wdTypeHeaders </w:t>
+      </w:r>
+    </w:p>
+    <w:p>
+      <w:pPr>
+        <w:pStyle w:val="ParNormalms"/>
+      </w:pPr>
+      <w:r>
+        <w:t>&lt;bb_category&gt;General</w:t>
+      </w:r>
+    </w:p>
+    <w:p>
+      <w:pPr>
+        <w:pStyle w:val="ParNormalms"/>
+      </w:pPr>
+      <w:r>
+        <w:t>&lt;bb_description&gt;Wider header, as in a book</w:t>
+      </w:r>
+    </w:p>
+    <w:p>
+      <w:pPr>
+        <w:pStyle w:val="ParNormalms"/>
+      </w:pPr>
+      <w:r>
+        <w:t xml:space="preserve">&lt;bb_insertoptions&gt;wdInsertContent </w:t>
+      </w:r>
+    </w:p>
+    <w:tbl>
+      <w:tblPr>
+        <w:tblStyle w:val="TableGrid"/>
+        <w:tblW w:w="10773" w:type="dxa"/>
+        <w:tblInd w:w="-397" w:type="dxa"/>
+        <w:tblLook w:val="04A0" w:firstRow="1" w:lastRow="0" w:firstColumn="1" w:lastColumn="0" w:noHBand="0" w:noVBand="1"/>
+      </w:tblPr>
+      <w:tblGrid>
+        <w:gridCol w:w="3591"/>
+        <w:gridCol w:w="3591"/>
+        <w:gridCol w:w="3591"/>
+      </w:tblGrid>
+      <w:tr>
+        <w:trPr>
+          <w:cnfStyle w:val="100000000000" w:firstRow="1" w:lastRow="0" w:firstColumn="0" w:lastColumn="0" w:oddVBand="0" w:evenVBand="0" w:oddHBand="0" w:evenHBand="0" w:firstRowFirstColumn="0" w:firstRowLastColumn="0" w:lastRowFirstColumn="0" w:lastRowLastColumn="0"/>
+          <w:trHeight w:hRule="exact" w:val="284"/>
+        </w:trPr>
+        <w:tc>
+          <w:tcPr>
+            <w:tcW w:w="3326" w:type="dxa"/>
+            <w:tcBorders>
+              <w:bottom w:val="single" w:sz="8" w:space="0" w:color="00B050"/>
+            </w:tcBorders>
+            <w:tcMar>
+              <w:left w:w="0" w:type="dxa"/>
+              <w:right w:w="0" w:type="dxa"/>
+            </w:tcMar>
+            <w:vAlign w:val="top"/>
+          </w:tcPr>
+          <w:p>
+            <w:pPr>
+              <w:pStyle w:val="ParNormalms"/>
+            </w:pPr>
+            <w:r>
+              <w:fldChar w:fldCharType="begin"/>
+            </w:r>
+            <w:r>
+              <w:instrText xml:space="preserve"> DOCPROPERTY  ms_DocumentTitle2  \* MERGEFORMAT </w:instrText>
+            </w:r>
+            <w:r>
+              <w:fldChar w:fldCharType="separate"/>
+            </w:r>
+            <w:r>
+              <w:t>product / system full name</w:t>
+            </w:r>
+            <w:r>
+              <w:fldChar w:fldCharType="end"/>
+            </w:r>
+          </w:p>
+        </w:tc>
+        <w:tc>
+          <w:tcPr>
+            <w:tcW w:w="3327" w:type="dxa"/>
+            <w:tcBorders>
+              <w:bottom w:val="single" w:sz="8" w:space="0" w:color="00B050"/>
+            </w:tcBorders>
+            <w:tcMar>
+              <w:left w:w="0" w:type="dxa"/>
+              <w:right w:w="0" w:type="dxa"/>
+            </w:tcMar>
+            <w:vAlign w:val="top"/>
+          </w:tcPr>
+          <w:p>
+            <w:pPr>
+              <w:pStyle w:val="ParNormalms"/>
+              <w:jc w:val="center"/>
+            </w:pPr>
+            <w:r>
+              <w:fldChar w:fldCharType="begin"/>
+            </w:r>
+            <w:r>
+              <w:instrText xml:space="preserve"> DOCPROPERTY  ms_DocumentTitle1  \* MERGEFORMAT </w:instrText>
+            </w:r>
+            <w:r>
+              <w:fldChar w:fldCharType="separate"/>
+            </w:r>
+            <w:r>
+              <w:t>product / system short name</w:t>
+            </w:r>
+            <w:r>
+              <w:fldChar w:fldCharType="end"/>
+            </w:r>
+          </w:p>
+        </w:tc>
+        <w:tc>
+          <w:tcPr>
+            <w:tcW w:w="3327" w:type="dxa"/>
+            <w:tcBorders>
+              <w:bottom w:val="single" w:sz="8" w:space="0" w:color="00B050"/>
+            </w:tcBorders>
+            <w:tcMar>
+              <w:left w:w="0" w:type="dxa"/>
+              <w:right w:w="0" w:type="dxa"/>
+            </w:tcMar>
+            <w:vAlign w:val="top"/>
+          </w:tcPr>
+          <w:p>
+            <w:pPr>
+              <w:pStyle w:val="ParNormalms"/>
+              <w:jc w:val="right"/>
+            </w:pPr>
+            <w:r>
+              <w:fldChar w:fldCharType="begin"/>
+            </w:r>
+            <w:r>
+              <w:instrText xml:space="preserve"> AUTHOR   \* MERGEFORMAT </w:instrText>
+            </w:r>
+            <w:r>
+              <w:fldChar w:fldCharType="separate"/>
+            </w:r>
+            <w:r>
+              <w:rPr>
+                <w:noProof/>
+              </w:rPr>
+              <w:t>Maciej Słojewski</w:t>
+            </w:r>
+            <w:r>
+              <w:rPr>
+                <w:noProof/>
               </w:rPr>
               <w:fldChar w:fldCharType="end"/>
             </w:r>
@@ -8910,7 +9255,7 @@
                 <w:rStyle w:val="CharDefaultms"/>
                 <w:noProof/>
               </w:rPr>
-              <w:t>16</w:t>
+              <w:t>15</w:t>
             </w:r>
             <w:r>
               <w:rPr>
@@ -8936,13 +9281,460 @@
       <w:pPr>
         <w:pStyle w:val="ParNormalms"/>
       </w:pPr>
-    </w:p>
-    <w:p>
-      <w:pPr>
-        <w:pStyle w:val="ParNormalms"/>
-      </w:pPr>
-      <w:r>
-        <w:lastRenderedPageBreak/>
+      <w:r>
+        <w:t>&lt;bb_name&gt;</w:t>
+      </w:r>
+      <w:r>
+        <w:t>FooterWide</w:t>
+      </w:r>
+      <w:r>
+        <w:t>R</w:t>
+      </w:r>
+      <w:r>
+        <w:t>ight</w:t>
+      </w:r>
+    </w:p>
+    <w:p>
+      <w:pPr>
+        <w:pStyle w:val="ParNormalms"/>
+      </w:pPr>
+      <w:r>
+        <w:t xml:space="preserve">&lt;bb_type&gt; wdTypeFooters </w:t>
+      </w:r>
+    </w:p>
+    <w:p>
+      <w:pPr>
+        <w:pStyle w:val="ParNormalms"/>
+      </w:pPr>
+      <w:r>
+        <w:t xml:space="preserve">&lt;bb_category&gt;General </w:t>
+      </w:r>
+    </w:p>
+    <w:p>
+      <w:pPr>
+        <w:pStyle w:val="ParNormalms"/>
+      </w:pPr>
+      <w:r>
+        <w:t>&lt;bb_description&gt;</w:t>
+      </w:r>
+      <w:r>
+        <w:t>Wider footer</w:t>
+      </w:r>
+      <w:r>
+        <w:t>, as in a book</w:t>
+      </w:r>
+    </w:p>
+    <w:p>
+      <w:pPr>
+        <w:pStyle w:val="ParNormalms"/>
+      </w:pPr>
+      <w:r>
+        <w:t xml:space="preserve">&lt;bb_insertoptions&gt;wdInsertContent </w:t>
+      </w:r>
+    </w:p>
+    <w:tbl>
+      <w:tblPr>
+        <w:tblW w:w="10773" w:type="dxa"/>
+        <w:tblInd w:w="-397" w:type="dxa"/>
+        <w:tblBorders>
+          <w:top w:val="single" w:sz="4" w:space="0" w:color="auto"/>
+        </w:tblBorders>
+        <w:tblLayout w:type="fixed"/>
+        <w:tblCellMar>
+          <w:left w:w="0" w:type="dxa"/>
+          <w:right w:w="0" w:type="dxa"/>
+        </w:tblCellMar>
+        <w:tblLook w:val="04A0" w:firstRow="1" w:lastRow="0" w:firstColumn="1" w:lastColumn="0" w:noHBand="0" w:noVBand="1"/>
+      </w:tblPr>
+      <w:tblGrid>
+        <w:gridCol w:w="4605"/>
+        <w:gridCol w:w="4270"/>
+        <w:gridCol w:w="1898"/>
+      </w:tblGrid>
+      <w:tr>
+        <w:trPr>
+          <w:cantSplit/>
+          <w:trHeight w:hRule="exact" w:val="284"/>
+        </w:trPr>
+        <w:tc>
+          <w:tcPr>
+            <w:tcW w:w="4266" w:type="dxa"/>
+            <w:tcBorders>
+              <w:top w:val="single" w:sz="8" w:space="0" w:color="6DB126" w:themeColor="accent1"/>
+              <w:left w:val="nil"/>
+              <w:bottom w:val="nil"/>
+              <w:right w:val="nil"/>
+            </w:tcBorders>
+            <w:vAlign w:val="bottom"/>
+            <w:hideMark/>
+          </w:tcPr>
+          <w:p>
+            <w:pPr>
+              <w:pStyle w:val="ParNormalms"/>
+              <w:rPr>
+                <w:rStyle w:val="CharDefaultms"/>
+              </w:rPr>
+            </w:pPr>
+          </w:p>
+        </w:tc>
+        <w:tc>
+          <w:tcPr>
+            <w:tcW w:w="3956" w:type="dxa"/>
+            <w:tcBorders>
+              <w:top w:val="single" w:sz="8" w:space="0" w:color="6DB126" w:themeColor="accent1"/>
+              <w:left w:val="nil"/>
+              <w:bottom w:val="nil"/>
+              <w:right w:val="nil"/>
+            </w:tcBorders>
+            <w:vAlign w:val="bottom"/>
+            <w:hideMark/>
+          </w:tcPr>
+          <w:p>
+            <w:pPr>
+              <w:pStyle w:val="ParNormalms"/>
+              <w:jc w:val="center"/>
+              <w:rPr>
+                <w:rStyle w:val="CharDefaultms"/>
+              </w:rPr>
+            </w:pPr>
+          </w:p>
+        </w:tc>
+        <w:tc>
+          <w:tcPr>
+            <w:tcW w:w="1758" w:type="dxa"/>
+            <w:tcBorders>
+              <w:top w:val="single" w:sz="8" w:space="0" w:color="6DB126" w:themeColor="accent1"/>
+              <w:left w:val="nil"/>
+              <w:bottom w:val="nil"/>
+              <w:right w:val="nil"/>
+            </w:tcBorders>
+            <w:vAlign w:val="bottom"/>
+            <w:hideMark/>
+          </w:tcPr>
+          <w:p>
+            <w:pPr>
+              <w:pStyle w:val="ParNormalms"/>
+              <w:jc w:val="right"/>
+              <w:rPr>
+                <w:rStyle w:val="CharDefaultms"/>
+              </w:rPr>
+            </w:pPr>
+            <w:r>
+              <w:rPr>
+                <w:rStyle w:val="CharDefaultms"/>
+              </w:rPr>
+              <w:t xml:space="preserve">Page </w:t>
+            </w:r>
+            <w:r>
+              <w:rPr>
+                <w:rStyle w:val="CharDefaultms"/>
+              </w:rPr>
+              <w:fldChar w:fldCharType="begin"/>
+            </w:r>
+            <w:r>
+              <w:rPr>
+                <w:rStyle w:val="CharDefaultms"/>
+              </w:rPr>
+              <w:instrText xml:space="preserve"> PAGE </w:instrText>
+            </w:r>
+            <w:r>
+              <w:rPr>
+                <w:rStyle w:val="CharDefaultms"/>
+              </w:rPr>
+              <w:fldChar w:fldCharType="separate"/>
+            </w:r>
+            <w:r>
+              <w:rPr>
+                <w:rStyle w:val="CharDefaultms"/>
+                <w:noProof/>
+              </w:rPr>
+              <w:t>10</w:t>
+            </w:r>
+            <w:r>
+              <w:rPr>
+                <w:rStyle w:val="CharDefaultms"/>
+              </w:rPr>
+              <w:fldChar w:fldCharType="end"/>
+            </w:r>
+            <w:r>
+              <w:rPr>
+                <w:rStyle w:val="CharDefaultms"/>
+              </w:rPr>
+              <w:t xml:space="preserve"> of </w:t>
+            </w:r>
+            <w:r>
+              <w:rPr>
+                <w:rStyle w:val="CharDefaultms"/>
+              </w:rPr>
+              <w:fldChar w:fldCharType="begin"/>
+            </w:r>
+            <w:r>
+              <w:rPr>
+                <w:rStyle w:val="CharDefaultms"/>
+              </w:rPr>
+              <w:instrText xml:space="preserve"> NUMPAGES  \* MERGEFORMAT </w:instrText>
+            </w:r>
+            <w:r>
+              <w:rPr>
+                <w:rStyle w:val="CharDefaultms"/>
+              </w:rPr>
+              <w:fldChar w:fldCharType="separate"/>
+            </w:r>
+            <w:r>
+              <w:rPr>
+                <w:rStyle w:val="CharDefaultms"/>
+                <w:noProof/>
+              </w:rPr>
+              <w:t>15</w:t>
+            </w:r>
+            <w:r>
+              <w:rPr>
+                <w:rStyle w:val="CharDefaultms"/>
+              </w:rPr>
+              <w:fldChar w:fldCharType="end"/>
+            </w:r>
+          </w:p>
+        </w:tc>
+      </w:tr>
+    </w:tbl>
+    <w:p>
+      <w:pPr>
+        <w:pStyle w:val="ParMinimalms"/>
+      </w:pPr>
+    </w:p>
+    <w:p>
+      <w:pPr>
+        <w:pStyle w:val="ParNormalms"/>
+      </w:pPr>
+    </w:p>
+    <w:p>
+      <w:pPr>
+        <w:pStyle w:val="ParNormalms"/>
+      </w:pPr>
+      <w:r>
+        <w:t>&lt;bb_name&gt;FooterWide</w:t>
+      </w:r>
+      <w:r>
+        <w:t>Left</w:t>
+      </w:r>
+    </w:p>
+    <w:p>
+      <w:pPr>
+        <w:pStyle w:val="ParNormalms"/>
+      </w:pPr>
+      <w:r>
+        <w:t xml:space="preserve">&lt;bb_type&gt; wdTypeFooters </w:t>
+      </w:r>
+    </w:p>
+    <w:p>
+      <w:pPr>
+        <w:pStyle w:val="ParNormalms"/>
+      </w:pPr>
+      <w:r>
+        <w:t xml:space="preserve">&lt;bb_category&gt;General </w:t>
+      </w:r>
+    </w:p>
+    <w:p>
+      <w:pPr>
+        <w:pStyle w:val="ParNormalms"/>
+      </w:pPr>
+      <w:r>
+        <w:t>&lt;bb_description&gt;Wider footer, as in a book</w:t>
+      </w:r>
+    </w:p>
+    <w:p>
+      <w:pPr>
+        <w:pStyle w:val="ParNormalms"/>
+      </w:pPr>
+      <w:r>
+        <w:t xml:space="preserve">&lt;bb_insertoptions&gt;wdInsertContent </w:t>
+      </w:r>
+    </w:p>
+    <w:tbl>
+      <w:tblPr>
+        <w:tblW w:w="10773" w:type="dxa"/>
+        <w:tblInd w:w="-397" w:type="dxa"/>
+        <w:tblBorders>
+          <w:top w:val="single" w:sz="4" w:space="0" w:color="auto"/>
+        </w:tblBorders>
+        <w:tblLayout w:type="fixed"/>
+        <w:tblCellMar>
+          <w:left w:w="0" w:type="dxa"/>
+          <w:right w:w="0" w:type="dxa"/>
+        </w:tblCellMar>
+        <w:tblLook w:val="04A0" w:firstRow="1" w:lastRow="0" w:firstColumn="1" w:lastColumn="0" w:noHBand="0" w:noVBand="1"/>
+      </w:tblPr>
+      <w:tblGrid>
+        <w:gridCol w:w="4605"/>
+        <w:gridCol w:w="4270"/>
+        <w:gridCol w:w="1898"/>
+      </w:tblGrid>
+      <w:tr>
+        <w:trPr>
+          <w:cantSplit/>
+          <w:trHeight w:hRule="exact" w:val="284"/>
+        </w:trPr>
+        <w:tc>
+          <w:tcPr>
+            <w:tcW w:w="4266" w:type="dxa"/>
+            <w:tcBorders>
+              <w:top w:val="single" w:sz="8" w:space="0" w:color="6DB126" w:themeColor="accent1"/>
+              <w:left w:val="nil"/>
+              <w:bottom w:val="nil"/>
+              <w:right w:val="nil"/>
+            </w:tcBorders>
+            <w:vAlign w:val="bottom"/>
+            <w:hideMark/>
+          </w:tcPr>
+          <w:p>
+            <w:pPr>
+              <w:pStyle w:val="ParNormalms"/>
+              <w:rPr>
+                <w:rStyle w:val="CharDefaultms"/>
+              </w:rPr>
+            </w:pPr>
+            <w:r>
+              <w:rPr>
+                <w:rStyle w:val="CharDefaultms"/>
+              </w:rPr>
+              <w:t xml:space="preserve">Page </w:t>
+            </w:r>
+            <w:r>
+              <w:rPr>
+                <w:rStyle w:val="CharDefaultms"/>
+              </w:rPr>
+              <w:fldChar w:fldCharType="begin"/>
+            </w:r>
+            <w:r>
+              <w:rPr>
+                <w:rStyle w:val="CharDefaultms"/>
+              </w:rPr>
+              <w:instrText xml:space="preserve"> PAGE </w:instrText>
+            </w:r>
+            <w:r>
+              <w:rPr>
+                <w:rStyle w:val="CharDefaultms"/>
+              </w:rPr>
+              <w:fldChar w:fldCharType="separate"/>
+            </w:r>
+            <w:r>
+              <w:rPr>
+                <w:rStyle w:val="CharDefaultms"/>
+                <w:noProof/>
+              </w:rPr>
+              <w:t>10</w:t>
+            </w:r>
+            <w:r>
+              <w:rPr>
+                <w:rStyle w:val="CharDefaultms"/>
+              </w:rPr>
+              <w:fldChar w:fldCharType="end"/>
+            </w:r>
+            <w:r>
+              <w:rPr>
+                <w:rStyle w:val="CharDefaultms"/>
+              </w:rPr>
+              <w:t xml:space="preserve"> of </w:t>
+            </w:r>
+            <w:r>
+              <w:rPr>
+                <w:rStyle w:val="CharDefaultms"/>
+              </w:rPr>
+              <w:fldChar w:fldCharType="begin"/>
+            </w:r>
+            <w:r>
+              <w:rPr>
+                <w:rStyle w:val="CharDefaultms"/>
+              </w:rPr>
+              <w:instrText xml:space="preserve"> NUMPAGES  \* MERGEFORMAT </w:instrText>
+            </w:r>
+            <w:r>
+              <w:rPr>
+                <w:rStyle w:val="CharDefaultms"/>
+              </w:rPr>
+              <w:fldChar w:fldCharType="separate"/>
+            </w:r>
+            <w:r>
+              <w:rPr>
+                <w:rStyle w:val="CharDefaultms"/>
+                <w:noProof/>
+              </w:rPr>
+              <w:t>15</w:t>
+            </w:r>
+            <w:r>
+              <w:rPr>
+                <w:rStyle w:val="CharDefaultms"/>
+              </w:rPr>
+              <w:fldChar w:fldCharType="end"/>
+            </w:r>
+          </w:p>
+        </w:tc>
+        <w:tc>
+          <w:tcPr>
+            <w:tcW w:w="3956" w:type="dxa"/>
+            <w:tcBorders>
+              <w:top w:val="single" w:sz="8" w:space="0" w:color="6DB126" w:themeColor="accent1"/>
+              <w:left w:val="nil"/>
+              <w:bottom w:val="nil"/>
+              <w:right w:val="nil"/>
+            </w:tcBorders>
+            <w:vAlign w:val="bottom"/>
+            <w:hideMark/>
+          </w:tcPr>
+          <w:p>
+            <w:pPr>
+              <w:pStyle w:val="ParNormalms"/>
+              <w:jc w:val="center"/>
+              <w:rPr>
+                <w:rStyle w:val="CharDefaultms"/>
+              </w:rPr>
+            </w:pPr>
+          </w:p>
+        </w:tc>
+        <w:tc>
+          <w:tcPr>
+            <w:tcW w:w="1758" w:type="dxa"/>
+            <w:tcBorders>
+              <w:top w:val="single" w:sz="8" w:space="0" w:color="6DB126" w:themeColor="accent1"/>
+              <w:left w:val="nil"/>
+              <w:bottom w:val="nil"/>
+              <w:right w:val="nil"/>
+            </w:tcBorders>
+            <w:vAlign w:val="bottom"/>
+            <w:hideMark/>
+          </w:tcPr>
+          <w:p>
+            <w:pPr>
+              <w:pStyle w:val="ParNormalms"/>
+              <w:jc w:val="right"/>
+              <w:rPr>
+                <w:rStyle w:val="CharDefaultms"/>
+              </w:rPr>
+            </w:pPr>
+          </w:p>
+        </w:tc>
+      </w:tr>
+    </w:tbl>
+    <w:p>
+      <w:pPr>
+        <w:pStyle w:val="ParMinimalms"/>
+      </w:pPr>
+    </w:p>
+    <w:p>
+      <w:pPr>
+        <w:pStyle w:val="ParNormalms"/>
+      </w:pPr>
+    </w:p>
+    <w:p>
+      <w:pPr>
+        <w:pStyle w:val="ParNormalms"/>
+      </w:pPr>
+    </w:p>
+    <w:p>
+      <w:pPr>
+        <w:pStyle w:val="ParNormalms"/>
+      </w:pPr>
+      <w:r>
         <w:t>&lt;bb_name&gt;Table</w:t>
       </w:r>
     </w:p>
@@ -9479,7 +10271,6 @@
                 <w:rStyle w:val="CharDefaultms"/>
                 <w:sz w:val="28"/>
               </w:rPr>
-              <w:lastRenderedPageBreak/>
               <w:fldChar w:fldCharType="begin"/>
             </w:r>
             <w:r>
@@ -10134,8 +10925,8 @@
       <w:bookmarkStart w:id="39" w:name="_Toc194653177"/>
       <w:bookmarkStart w:id="40" w:name="_Toc194923243"/>
       <w:bookmarkStart w:id="41" w:name="_Toc206674325"/>
-      <w:bookmarkStart w:id="42" w:name="_Toc220266749"/>
-      <w:bookmarkStart w:id="43" w:name="_Toc220266761"/>
+      <w:bookmarkStart w:id="42" w:name="_Toc221960872"/>
+      <w:bookmarkStart w:id="43" w:name="_Toc221960884"/>
       <w:r>
         <w:t>Change log</w:t>
       </w:r>
@@ -10667,7 +11458,6 @@
         <w:pStyle w:val="ParNormalms"/>
       </w:pPr>
       <w:r>
-        <w:lastRenderedPageBreak/>
         <w:t xml:space="preserve">&lt;bb_type&gt; wdTypeFooters </w:t>
       </w:r>
     </w:p>
@@ -11640,7 +12430,6 @@
         <w:rPr>
           <w:noProof/>
         </w:rPr>
-        <w:lastRenderedPageBreak/>
         <mc:AlternateContent>
           <mc:Choice Requires="wpc">
             <w:drawing>
@@ -12073,28 +12862,28 @@
               <w:rPr>
                 <w:noProof/>
               </w:rPr>
+              <w:t>13</w:t>
+            </w:r>
+            <w:r>
+              <w:fldChar w:fldCharType="end"/>
+            </w:r>
+            <w:r>
+              <w:t xml:space="preserve"> of </w:t>
+            </w:r>
+            <w:r>
+              <w:fldChar w:fldCharType="begin"/>
+            </w:r>
+            <w:r>
+              <w:instrText xml:space="preserve"> NUMPAGES </w:instrText>
+            </w:r>
+            <w:r>
+              <w:fldChar w:fldCharType="separate"/>
+            </w:r>
+            <w:r>
+              <w:rPr>
+                <w:noProof/>
+              </w:rPr>
               <w:t>15</w:t>
-            </w:r>
-            <w:r>
-              <w:fldChar w:fldCharType="end"/>
-            </w:r>
-            <w:r>
-              <w:t xml:space="preserve"> of </w:t>
-            </w:r>
-            <w:r>
-              <w:fldChar w:fldCharType="begin"/>
-            </w:r>
-            <w:r>
-              <w:instrText xml:space="preserve"> NUMPAGES </w:instrText>
-            </w:r>
-            <w:r>
-              <w:fldChar w:fldCharType="separate"/>
-            </w:r>
-            <w:r>
-              <w:rPr>
-                <w:noProof/>
-              </w:rPr>
-              <w:t>16</w:t>
             </w:r>
             <w:r>
               <w:rPr>
@@ -12220,8 +13009,8 @@
       <w:pPr>
         <w:pStyle w:val="ParListHeadingms"/>
       </w:pPr>
-      <w:bookmarkStart w:id="49" w:name="_Toc220266750"/>
-      <w:bookmarkStart w:id="50" w:name="_Toc220266762"/>
+      <w:bookmarkStart w:id="49" w:name="_Toc221960873"/>
+      <w:bookmarkStart w:id="50" w:name="_Toc221960885"/>
       <w:r>
         <w:t>List of Content</w:t>
       </w:r>
@@ -12306,7 +13095,7 @@
         </w:rPr>
         <w:fldChar w:fldCharType="separate"/>
       </w:r>
-      <w:hyperlink w:anchor="_Toc220266752" w:history="1">
+      <w:hyperlink w:anchor="_Toc221960875" w:history="1">
         <w:r>
           <w:rPr>
             <w:rStyle w:val="Hyperlink"/>
@@ -12333,7 +13122,7 @@
             <w:noProof/>
             <w:webHidden/>
           </w:rPr>
-          <w:instrText xml:space="preserve"> PAGEREF _Toc220266752 \h </w:instrText>
+          <w:instrText xml:space="preserve"> PAGEREF _Toc221960875 \h </w:instrText>
         </w:r>
         <w:r>
           <w:rPr>
@@ -12379,7 +13168,7 @@
           <w:lang w:val="pl-PL" w:eastAsia="pl-PL"/>
         </w:rPr>
       </w:pPr>
-      <w:hyperlink w:anchor="_Toc220266753" w:history="1">
+      <w:hyperlink w:anchor="_Toc221960876" w:history="1">
         <w:r>
           <w:rPr>
             <w:rStyle w:val="Hyperlink"/>
@@ -12406,7 +13195,7 @@
             <w:noProof/>
             <w:webHidden/>
           </w:rPr>
-          <w:instrText xml:space="preserve"> PAGEREF _Toc220266753 \h </w:instrText>
+          <w:instrText xml:space="preserve"> PAGEREF _Toc221960876 \h </w:instrText>
         </w:r>
         <w:r>
           <w:rPr>
@@ -12452,7 +13241,7 @@
           <w:lang w:val="pl-PL" w:eastAsia="pl-PL"/>
         </w:rPr>
       </w:pPr>
-      <w:hyperlink w:anchor="_Toc220266754" w:history="1">
+      <w:hyperlink w:anchor="_Toc221960877" w:history="1">
         <w:r>
           <w:rPr>
             <w:rStyle w:val="Hyperlink"/>
@@ -12479,7 +13268,7 @@
             <w:noProof/>
             <w:webHidden/>
           </w:rPr>
-          <w:instrText xml:space="preserve"> PAGEREF _Toc220266754 \h </w:instrText>
+          <w:instrText xml:space="preserve"> PAGEREF _Toc221960877 \h </w:instrText>
         </w:r>
         <w:r>
           <w:rPr>
@@ -12525,7 +13314,7 @@
           <w:lang w:val="pl-PL" w:eastAsia="pl-PL"/>
         </w:rPr>
       </w:pPr>
-      <w:hyperlink w:anchor="_Toc220266755" w:history="1">
+      <w:hyperlink w:anchor="_Toc221960878" w:history="1">
         <w:r>
           <w:rPr>
             <w:rStyle w:val="Hyperlink"/>
@@ -12552,7 +13341,7 @@
             <w:noProof/>
             <w:webHidden/>
           </w:rPr>
-          <w:instrText xml:space="preserve"> PAGEREF _Toc220266755 \h </w:instrText>
+          <w:instrText xml:space="preserve"> PAGEREF _Toc221960878 \h </w:instrText>
         </w:r>
         <w:r>
           <w:rPr>
@@ -12598,7 +13387,7 @@
           <w:lang w:val="pl-PL" w:eastAsia="pl-PL"/>
         </w:rPr>
       </w:pPr>
-      <w:hyperlink w:anchor="_Toc220266756" w:history="1">
+      <w:hyperlink w:anchor="_Toc221960879" w:history="1">
         <w:r>
           <w:rPr>
             <w:rStyle w:val="Hyperlink"/>
@@ -12625,7 +13414,7 @@
             <w:noProof/>
             <w:webHidden/>
           </w:rPr>
-          <w:instrText xml:space="preserve"> PAGEREF _Toc220266756 \h </w:instrText>
+          <w:instrText xml:space="preserve"> PAGEREF _Toc221960879 \h </w:instrText>
         </w:r>
         <w:r>
           <w:rPr>
@@ -12671,7 +13460,7 @@
           <w:lang w:val="pl-PL" w:eastAsia="pl-PL"/>
         </w:rPr>
       </w:pPr>
-      <w:hyperlink w:anchor="_Toc220266757" w:history="1">
+      <w:hyperlink w:anchor="_Toc221960880" w:history="1">
         <w:r>
           <w:rPr>
             <w:rStyle w:val="Hyperlink"/>
@@ -12698,7 +13487,7 @@
             <w:noProof/>
             <w:webHidden/>
           </w:rPr>
-          <w:instrText xml:space="preserve"> PAGEREF _Toc220266757 \h </w:instrText>
+          <w:instrText xml:space="preserve"> PAGEREF _Toc221960880 \h </w:instrText>
         </w:r>
         <w:r>
           <w:rPr>
@@ -12744,7 +13533,7 @@
           <w:lang w:val="pl-PL" w:eastAsia="pl-PL"/>
         </w:rPr>
       </w:pPr>
-      <w:hyperlink w:anchor="_Toc220266758" w:history="1">
+      <w:hyperlink w:anchor="_Toc221960881" w:history="1">
         <w:r>
           <w:rPr>
             <w:rStyle w:val="Hyperlink"/>
@@ -12771,7 +13560,7 @@
             <w:noProof/>
             <w:webHidden/>
           </w:rPr>
-          <w:instrText xml:space="preserve"> PAGEREF _Toc220266758 \h </w:instrText>
+          <w:instrText xml:space="preserve"> PAGEREF _Toc221960881 \h </w:instrText>
         </w:r>
         <w:r>
           <w:rPr>
@@ -12817,7 +13606,7 @@
           <w:lang w:val="pl-PL" w:eastAsia="pl-PL"/>
         </w:rPr>
       </w:pPr>
-      <w:hyperlink w:anchor="_Toc220266759" w:history="1">
+      <w:hyperlink w:anchor="_Toc221960882" w:history="1">
         <w:r>
           <w:rPr>
             <w:rStyle w:val="Hyperlink"/>
@@ -12844,7 +13633,7 @@
             <w:noProof/>
             <w:webHidden/>
           </w:rPr>
-          <w:instrText xml:space="preserve"> PAGEREF _Toc220266759 \h </w:instrText>
+          <w:instrText xml:space="preserve"> PAGEREF _Toc221960882 \h </w:instrText>
         </w:r>
         <w:r>
           <w:rPr>
@@ -12890,7 +13679,7 @@
           <w:lang w:val="pl-PL" w:eastAsia="pl-PL"/>
         </w:rPr>
       </w:pPr>
-      <w:hyperlink w:anchor="_Toc220266760" w:history="1">
+      <w:hyperlink w:anchor="_Toc221960883" w:history="1">
         <w:r>
           <w:rPr>
             <w:rStyle w:val="Hyperlink"/>
@@ -12917,7 +13706,7 @@
             <w:noProof/>
             <w:webHidden/>
           </w:rPr>
-          <w:instrText xml:space="preserve"> PAGEREF _Toc220266760 \h </w:instrText>
+          <w:instrText xml:space="preserve"> PAGEREF _Toc221960883 \h </w:instrText>
         </w:r>
         <w:r>
           <w:rPr>
@@ -12963,7 +13752,7 @@
           <w:lang w:val="pl-PL" w:eastAsia="pl-PL"/>
         </w:rPr>
       </w:pPr>
-      <w:hyperlink w:anchor="_Toc220266761" w:history="1">
+      <w:hyperlink w:anchor="_Toc221960884" w:history="1">
         <w:r>
           <w:rPr>
             <w:rStyle w:val="Hyperlink"/>
@@ -12990,7 +13779,7 @@
             <w:noProof/>
             <w:webHidden/>
           </w:rPr>
-          <w:instrText xml:space="preserve"> PAGEREF _Toc220266761 \h </w:instrText>
+          <w:instrText xml:space="preserve"> PAGEREF _Toc221960884 \h </w:instrText>
         </w:r>
         <w:r>
           <w:rPr>
@@ -13010,7 +13799,7 @@
             <w:noProof/>
             <w:webHidden/>
           </w:rPr>
-          <w:t>11</w:t>
+          <w:t>12</w:t>
         </w:r>
         <w:r>
           <w:rPr>
@@ -13036,7 +13825,7 @@
           <w:lang w:val="pl-PL" w:eastAsia="pl-PL"/>
         </w:rPr>
       </w:pPr>
-      <w:hyperlink w:anchor="_Toc220266762" w:history="1">
+      <w:hyperlink w:anchor="_Toc221960885" w:history="1">
         <w:r>
           <w:rPr>
             <w:rStyle w:val="Hyperlink"/>
@@ -13063,7 +13852,7 @@
             <w:noProof/>
             <w:webHidden/>
           </w:rPr>
-          <w:instrText xml:space="preserve"> PAGEREF _Toc220266762 \h </w:instrText>
+          <w:instrText xml:space="preserve"> PAGEREF _Toc221960885 \h </w:instrText>
         </w:r>
         <w:r>
           <w:rPr>
@@ -13083,7 +13872,7 @@
             <w:noProof/>
             <w:webHidden/>
           </w:rPr>
-          <w:t>13</w:t>
+          <w:t>14</w:t>
         </w:r>
         <w:r>
           <w:rPr>
@@ -13109,7 +13898,7 @@
           <w:lang w:val="pl-PL" w:eastAsia="pl-PL"/>
         </w:rPr>
       </w:pPr>
-      <w:hyperlink w:anchor="_Toc220266763" w:history="1">
+      <w:hyperlink w:anchor="_Toc221960886" w:history="1">
         <w:r>
           <w:rPr>
             <w:rStyle w:val="Hyperlink"/>
@@ -13136,7 +13925,7 @@
             <w:noProof/>
             <w:webHidden/>
           </w:rPr>
-          <w:instrText xml:space="preserve"> PAGEREF _Toc220266763 \h </w:instrText>
+          <w:instrText xml:space="preserve"> PAGEREF _Toc221960886 \h </w:instrText>
         </w:r>
         <w:r>
           <w:rPr>
@@ -13156,7 +13945,7 @@
             <w:noProof/>
             <w:webHidden/>
           </w:rPr>
-          <w:t>14</w:t>
+          <w:t>15</w:t>
         </w:r>
         <w:r>
           <w:rPr>
@@ -13279,8 +14068,8 @@
       <w:pPr>
         <w:pStyle w:val="ParListHeadingms"/>
       </w:pPr>
-      <w:bookmarkStart w:id="51" w:name="_Toc220266751"/>
-      <w:bookmarkStart w:id="52" w:name="_Toc220266763"/>
+      <w:bookmarkStart w:id="51" w:name="_Toc221960874"/>
+      <w:bookmarkStart w:id="52" w:name="_Toc221960886"/>
       <w:r>
         <w:t>Change log</w:t>
       </w:r>
@@ -15054,7 +15843,7 @@
   </w:latentStyles>
   <w:style w:type="paragraph" w:default="1" w:styleId="Normal">
     <w:name w:val="Normal"/>
-    <w:rsid w:val="00D22DAA"/>
+    <w:rsid w:val="00F71514"/>
     <w:pPr>
       <w:spacing w:line="220" w:lineRule="exact"/>
     </w:pPr>
@@ -15626,7 +16415,7 @@
     <w:name w:val="ParNormal ms"/>
     <w:basedOn w:val="Normal"/>
     <w:link w:val="ParNormalmsChar"/>
-    <w:rsid w:val="003120E6"/>
+    <w:rsid w:val="0095588F"/>
     <w:pPr>
       <w:spacing w:after="120"/>
     </w:pPr>

</xml_diff>

<commit_message>
Excercises related to gutter, headers and footers.
</commit_message>
<xml_diff>
--- a/BuildingBlocks_ConfigurationFile/Files/BB_ms_BB_Content.docx
+++ b/BuildingBlocks_ConfigurationFile/Files/BB_ms_BB_Content.docx
@@ -3682,8 +3682,8 @@
         <w:pStyle w:val="ParListHeadingms"/>
       </w:pPr>
       <w:bookmarkStart w:id="4" w:name="_Toc140141395"/>
-      <w:bookmarkStart w:id="5" w:name="_Toc221960863"/>
-      <w:bookmarkStart w:id="6" w:name="_Toc221960875"/>
+      <w:bookmarkStart w:id="5" w:name="_Toc223036688"/>
+      <w:bookmarkStart w:id="6" w:name="_Toc223036700"/>
       <w:r>
         <w:t>List of symbols and icons</w:t>
       </w:r>
@@ -4627,8 +4627,8 @@
       <w:pPr>
         <w:pStyle w:val="ParListHeadingms"/>
       </w:pPr>
-      <w:bookmarkStart w:id="10" w:name="_Toc221960864"/>
-      <w:bookmarkStart w:id="11" w:name="_Toc221960876"/>
+      <w:bookmarkStart w:id="10" w:name="_Toc223036689"/>
+      <w:bookmarkStart w:id="11" w:name="_Toc223036701"/>
       <w:r>
         <w:t>List of acronyms</w:t>
       </w:r>
@@ -5632,8 +5632,8 @@
       <w:pPr>
         <w:pStyle w:val="ParListHeadingms"/>
       </w:pPr>
-      <w:bookmarkStart w:id="19" w:name="_Toc221960865"/>
-      <w:bookmarkStart w:id="20" w:name="_Toc221960877"/>
+      <w:bookmarkStart w:id="19" w:name="_Toc223036690"/>
+      <w:bookmarkStart w:id="20" w:name="_Toc223036702"/>
       <w:r>
         <w:t>List of Content</w:t>
       </w:r>
@@ -5718,7 +5718,7 @@
         </w:rPr>
         <w:fldChar w:fldCharType="separate"/>
       </w:r>
-      <w:hyperlink w:anchor="_Toc221960863" w:history="1">
+      <w:hyperlink w:anchor="_Toc223036688" w:history="1">
         <w:r>
           <w:rPr>
             <w:rStyle w:val="Hyperlink"/>
@@ -5745,7 +5745,7 @@
             <w:noProof/>
             <w:webHidden/>
           </w:rPr>
-          <w:instrText xml:space="preserve"> PAGEREF _Toc221960863 \h </w:instrText>
+          <w:instrText xml:space="preserve"> PAGEREF _Toc223036688 \h </w:instrText>
         </w:r>
         <w:r>
           <w:rPr>
@@ -5791,7 +5791,7 @@
           <w:lang w:val="pl-PL" w:eastAsia="pl-PL"/>
         </w:rPr>
       </w:pPr>
-      <w:hyperlink w:anchor="_Toc221960864" w:history="1">
+      <w:hyperlink w:anchor="_Toc223036689" w:history="1">
         <w:r>
           <w:rPr>
             <w:rStyle w:val="Hyperlink"/>
@@ -5818,7 +5818,7 @@
             <w:noProof/>
             <w:webHidden/>
           </w:rPr>
-          <w:instrText xml:space="preserve"> PAGEREF _Toc221960864 \h </w:instrText>
+          <w:instrText xml:space="preserve"> PAGEREF _Toc223036689 \h </w:instrText>
         </w:r>
         <w:r>
           <w:rPr>
@@ -5864,7 +5864,7 @@
           <w:lang w:val="pl-PL" w:eastAsia="pl-PL"/>
         </w:rPr>
       </w:pPr>
-      <w:hyperlink w:anchor="_Toc221960865" w:history="1">
+      <w:hyperlink w:anchor="_Toc223036690" w:history="1">
         <w:r>
           <w:rPr>
             <w:rStyle w:val="Hyperlink"/>
@@ -5891,7 +5891,7 @@
             <w:noProof/>
             <w:webHidden/>
           </w:rPr>
-          <w:instrText xml:space="preserve"> PAGEREF _Toc221960865 \h </w:instrText>
+          <w:instrText xml:space="preserve"> PAGEREF _Toc223036690 \h </w:instrText>
         </w:r>
         <w:r>
           <w:rPr>
@@ -5937,7 +5937,7 @@
           <w:lang w:val="pl-PL" w:eastAsia="pl-PL"/>
         </w:rPr>
       </w:pPr>
-      <w:hyperlink w:anchor="_Toc221960866" w:history="1">
+      <w:hyperlink w:anchor="_Toc223036691" w:history="1">
         <w:r>
           <w:rPr>
             <w:rStyle w:val="Hyperlink"/>
@@ -5964,7 +5964,7 @@
             <w:noProof/>
             <w:webHidden/>
           </w:rPr>
-          <w:instrText xml:space="preserve"> PAGEREF _Toc221960866 \h </w:instrText>
+          <w:instrText xml:space="preserve"> PAGEREF _Toc223036691 \h </w:instrText>
         </w:r>
         <w:r>
           <w:rPr>
@@ -6010,7 +6010,7 @@
           <w:lang w:val="pl-PL" w:eastAsia="pl-PL"/>
         </w:rPr>
       </w:pPr>
-      <w:hyperlink w:anchor="_Toc221960867" w:history="1">
+      <w:hyperlink w:anchor="_Toc223036692" w:history="1">
         <w:r>
           <w:rPr>
             <w:rStyle w:val="Hyperlink"/>
@@ -6037,7 +6037,7 @@
             <w:noProof/>
             <w:webHidden/>
           </w:rPr>
-          <w:instrText xml:space="preserve"> PAGEREF _Toc221960867 \h </w:instrText>
+          <w:instrText xml:space="preserve"> PAGEREF _Toc223036692 \h </w:instrText>
         </w:r>
         <w:r>
           <w:rPr>
@@ -6083,7 +6083,7 @@
           <w:lang w:val="pl-PL" w:eastAsia="pl-PL"/>
         </w:rPr>
       </w:pPr>
-      <w:hyperlink w:anchor="_Toc221960868" w:history="1">
+      <w:hyperlink w:anchor="_Toc223036693" w:history="1">
         <w:r>
           <w:rPr>
             <w:rStyle w:val="Hyperlink"/>
@@ -6110,7 +6110,7 @@
             <w:noProof/>
             <w:webHidden/>
           </w:rPr>
-          <w:instrText xml:space="preserve"> PAGEREF _Toc221960868 \h </w:instrText>
+          <w:instrText xml:space="preserve"> PAGEREF _Toc223036693 \h </w:instrText>
         </w:r>
         <w:r>
           <w:rPr>
@@ -6156,7 +6156,7 @@
           <w:lang w:val="pl-PL" w:eastAsia="pl-PL"/>
         </w:rPr>
       </w:pPr>
-      <w:hyperlink w:anchor="_Toc221960869" w:history="1">
+      <w:hyperlink w:anchor="_Toc223036694" w:history="1">
         <w:r>
           <w:rPr>
             <w:rStyle w:val="Hyperlink"/>
@@ -6183,7 +6183,7 @@
             <w:noProof/>
             <w:webHidden/>
           </w:rPr>
-          <w:instrText xml:space="preserve"> PAGEREF _Toc221960869 \h </w:instrText>
+          <w:instrText xml:space="preserve"> PAGEREF _Toc223036694 \h </w:instrText>
         </w:r>
         <w:r>
           <w:rPr>
@@ -6229,7 +6229,7 @@
           <w:lang w:val="pl-PL" w:eastAsia="pl-PL"/>
         </w:rPr>
       </w:pPr>
-      <w:hyperlink w:anchor="_Toc221960870" w:history="1">
+      <w:hyperlink w:anchor="_Toc223036695" w:history="1">
         <w:r>
           <w:rPr>
             <w:rStyle w:val="Hyperlink"/>
@@ -6256,7 +6256,7 @@
             <w:noProof/>
             <w:webHidden/>
           </w:rPr>
-          <w:instrText xml:space="preserve"> PAGEREF _Toc221960870 \h </w:instrText>
+          <w:instrText xml:space="preserve"> PAGEREF _Toc223036695 \h </w:instrText>
         </w:r>
         <w:r>
           <w:rPr>
@@ -6302,7 +6302,7 @@
           <w:lang w:val="pl-PL" w:eastAsia="pl-PL"/>
         </w:rPr>
       </w:pPr>
-      <w:hyperlink w:anchor="_Toc221960871" w:history="1">
+      <w:hyperlink w:anchor="_Toc223036696" w:history="1">
         <w:r>
           <w:rPr>
             <w:rStyle w:val="Hyperlink"/>
@@ -6329,7 +6329,7 @@
             <w:noProof/>
             <w:webHidden/>
           </w:rPr>
-          <w:instrText xml:space="preserve"> PAGEREF _Toc221960871 \h </w:instrText>
+          <w:instrText xml:space="preserve"> PAGEREF _Toc223036696 \h </w:instrText>
         </w:r>
         <w:r>
           <w:rPr>
@@ -6375,7 +6375,7 @@
           <w:lang w:val="pl-PL" w:eastAsia="pl-PL"/>
         </w:rPr>
       </w:pPr>
-      <w:hyperlink w:anchor="_Toc221960872" w:history="1">
+      <w:hyperlink w:anchor="_Toc223036697" w:history="1">
         <w:r>
           <w:rPr>
             <w:rStyle w:val="Hyperlink"/>
@@ -6402,7 +6402,7 @@
             <w:noProof/>
             <w:webHidden/>
           </w:rPr>
-          <w:instrText xml:space="preserve"> PAGEREF _Toc221960872 \h </w:instrText>
+          <w:instrText xml:space="preserve"> PAGEREF _Toc223036697 \h </w:instrText>
         </w:r>
         <w:r>
           <w:rPr>
@@ -6448,7 +6448,7 @@
           <w:lang w:val="pl-PL" w:eastAsia="pl-PL"/>
         </w:rPr>
       </w:pPr>
-      <w:hyperlink w:anchor="_Toc221960873" w:history="1">
+      <w:hyperlink w:anchor="_Toc223036698" w:history="1">
         <w:r>
           <w:rPr>
             <w:rStyle w:val="Hyperlink"/>
@@ -6475,7 +6475,7 @@
             <w:noProof/>
             <w:webHidden/>
           </w:rPr>
-          <w:instrText xml:space="preserve"> PAGEREF _Toc221960873 \h </w:instrText>
+          <w:instrText xml:space="preserve"> PAGEREF _Toc223036698 \h </w:instrText>
         </w:r>
         <w:r>
           <w:rPr>
@@ -6521,7 +6521,7 @@
           <w:lang w:val="pl-PL" w:eastAsia="pl-PL"/>
         </w:rPr>
       </w:pPr>
-      <w:hyperlink w:anchor="_Toc221960874" w:history="1">
+      <w:hyperlink w:anchor="_Toc223036699" w:history="1">
         <w:r>
           <w:rPr>
             <w:rStyle w:val="Hyperlink"/>
@@ -6548,7 +6548,7 @@
             <w:noProof/>
             <w:webHidden/>
           </w:rPr>
-          <w:instrText xml:space="preserve"> PAGEREF _Toc221960874 \h </w:instrText>
+          <w:instrText xml:space="preserve"> PAGEREF _Toc223036699 \h </w:instrText>
         </w:r>
         <w:r>
           <w:rPr>
@@ -6696,8 +6696,8 @@
         <w:t xml:space="preserve">&lt;bb_insertoptions&gt;wdInsertContent </w:t>
       </w:r>
     </w:p>
-    <w:bookmarkStart w:id="21" w:name="_Toc221960878" w:displacedByCustomXml="next"/>
-    <w:bookmarkStart w:id="22" w:name="_Toc221960866" w:displacedByCustomXml="next"/>
+    <w:bookmarkStart w:id="21" w:name="_Toc223036703" w:displacedByCustomXml="next"/>
+    <w:bookmarkStart w:id="22" w:name="_Toc223036691" w:displacedByCustomXml="next"/>
     <w:sdt>
       <w:sdtPr>
         <w:rPr>
@@ -7622,8 +7622,8 @@
       <w:pPr>
         <w:pStyle w:val="ParListHeadingms"/>
       </w:pPr>
-      <w:bookmarkStart w:id="23" w:name="_Toc221960867"/>
-      <w:bookmarkStart w:id="24" w:name="_Toc221960879"/>
+      <w:bookmarkStart w:id="23" w:name="_Toc223036692"/>
+      <w:bookmarkStart w:id="24" w:name="_Toc223036704"/>
       <w:r>
         <w:t>Change log</w:t>
       </w:r>
@@ -7976,8 +7976,8 @@
         <w:t>&lt;bb_insertoptions&gt;wdInsertContent</w:t>
       </w:r>
     </w:p>
-    <w:bookmarkStart w:id="25" w:name="_Toc221960880" w:displacedByCustomXml="next"/>
-    <w:bookmarkStart w:id="26" w:name="_Toc221960868" w:displacedByCustomXml="next"/>
+    <w:bookmarkStart w:id="25" w:name="_Toc223036705" w:displacedByCustomXml="next"/>
+    <w:bookmarkStart w:id="26" w:name="_Toc223036693" w:displacedByCustomXml="next"/>
     <w:sdt>
       <w:sdtPr>
         <w:rPr>
@@ -8139,8 +8139,8 @@
       <w:pPr>
         <w:pStyle w:val="ParListHeadingms"/>
       </w:pPr>
-      <w:bookmarkStart w:id="29" w:name="_Toc221960869"/>
-      <w:bookmarkStart w:id="30" w:name="_Toc221960881"/>
+      <w:bookmarkStart w:id="29" w:name="_Toc223036694"/>
+      <w:bookmarkStart w:id="30" w:name="_Toc223036706"/>
       <w:r>
         <w:t>List of Tables</w:t>
       </w:r>
@@ -8274,8 +8274,8 @@
       <w:pPr>
         <w:pStyle w:val="ParListHeadingms"/>
       </w:pPr>
-      <w:bookmarkStart w:id="33" w:name="_Toc221960870"/>
-      <w:bookmarkStart w:id="34" w:name="_Toc221960882"/>
+      <w:bookmarkStart w:id="33" w:name="_Toc223036695"/>
+      <w:bookmarkStart w:id="34" w:name="_Toc223036707"/>
       <w:r>
         <w:t xml:space="preserve">List of </w:t>
       </w:r>
@@ -8413,8 +8413,8 @@
       <w:pPr>
         <w:pStyle w:val="ParListHeadingms"/>
       </w:pPr>
-      <w:bookmarkStart w:id="35" w:name="_Toc221960871"/>
-      <w:bookmarkStart w:id="36" w:name="_Toc221960883"/>
+      <w:bookmarkStart w:id="35" w:name="_Toc223036696"/>
+      <w:bookmarkStart w:id="36" w:name="_Toc223036708"/>
       <w:r>
         <w:t>List of Tables</w:t>
       </w:r>
@@ -8907,21 +8907,11 @@
             <w:pPr>
               <w:pStyle w:val="ParNormalms"/>
             </w:pPr>
-            <w:r>
-              <w:fldChar w:fldCharType="begin"/>
-            </w:r>
-            <w:r>
-              <w:instrText xml:space="preserve"> DOCPROPERTY  ms_DocumentTitle2  \* MERGEFORMAT </w:instrText>
-            </w:r>
-            <w:r>
-              <w:fldChar w:fldCharType="separate"/>
-            </w:r>
-            <w:r>
-              <w:t>product / system full name</w:t>
-            </w:r>
-            <w:r>
-              <w:fldChar w:fldCharType="end"/>
-            </w:r>
+            <w:fldSimple w:instr=" DOCPROPERTY  ms_DocumentTitle2  \* MERGEFORMAT ">
+              <w:r>
+                <w:t>product / system full name</w:t>
+              </w:r>
+            </w:fldSimple>
           </w:p>
         </w:tc>
         <w:tc>
@@ -8941,21 +8931,11 @@
               <w:pStyle w:val="ParNormalms"/>
               <w:jc w:val="center"/>
             </w:pPr>
-            <w:r>
-              <w:fldChar w:fldCharType="begin"/>
-            </w:r>
-            <w:r>
-              <w:instrText xml:space="preserve"> DOCPROPERTY  ms_DocumentTitle1  \* MERGEFORMAT </w:instrText>
-            </w:r>
-            <w:r>
-              <w:fldChar w:fldCharType="separate"/>
-            </w:r>
-            <w:r>
-              <w:t>product / system short name</w:t>
-            </w:r>
-            <w:r>
-              <w:fldChar w:fldCharType="end"/>
-            </w:r>
+            <w:fldSimple w:instr=" DOCPROPERTY  ms_DocumentTitle1  \* MERGEFORMAT ">
+              <w:r>
+                <w:t>product / system short name</w:t>
+              </w:r>
+            </w:fldSimple>
           </w:p>
         </w:tc>
         <w:tc>
@@ -8975,27 +8955,14 @@
               <w:pStyle w:val="ParNormalms"/>
               <w:jc w:val="right"/>
             </w:pPr>
-            <w:r>
-              <w:fldChar w:fldCharType="begin"/>
-            </w:r>
-            <w:r>
-              <w:instrText xml:space="preserve"> AUTHOR   \* MERGEFORMAT </w:instrText>
-            </w:r>
-            <w:r>
-              <w:fldChar w:fldCharType="separate"/>
-            </w:r>
-            <w:r>
-              <w:rPr>
-                <w:noProof/>
-              </w:rPr>
-              <w:t>Maciej Słojewski</w:t>
-            </w:r>
-            <w:r>
-              <w:rPr>
-                <w:noProof/>
-              </w:rPr>
-              <w:fldChar w:fldCharType="end"/>
-            </w:r>
+            <w:fldSimple w:instr=" AUTHOR   \* MERGEFORMAT ">
+              <w:r>
+                <w:rPr>
+                  <w:noProof/>
+                </w:rPr>
+                <w:t>Maciej Słojewski</w:t>
+              </w:r>
+            </w:fldSimple>
           </w:p>
         </w:tc>
       </w:tr>
@@ -9050,21 +9017,15 @@
         <w:t xml:space="preserve"> </w:t>
       </w:r>
       <w:r>
-        <w:t>Default / ordinary document fo</w:t>
-      </w:r>
-      <w:r>
-        <w:t>oter</w:t>
-      </w:r>
-      <w:r>
-        <w:t>.</w:t>
-      </w:r>
-    </w:p>
-    <w:p>
-      <w:pPr>
-        <w:pStyle w:val="ParNormalms"/>
-      </w:pPr>
-      <w:r>
-        <w:t xml:space="preserve">&lt;bb_insertoptions&gt;wdInsertContent </w:t>
+        <w:t>Default / ordinary document footer.</w:t>
+      </w:r>
+    </w:p>
+    <w:p>
+      <w:pPr>
+        <w:pStyle w:val="ParNormalms"/>
+      </w:pPr>
+      <w:r>
+        <w:t>&lt;bb_insertoptions&gt;wdInsertContent</w:t>
       </w:r>
     </w:p>
     <w:tbl>
@@ -10925,8 +10886,8 @@
       <w:bookmarkStart w:id="39" w:name="_Toc194653177"/>
       <w:bookmarkStart w:id="40" w:name="_Toc194923243"/>
       <w:bookmarkStart w:id="41" w:name="_Toc206674325"/>
-      <w:bookmarkStart w:id="42" w:name="_Toc221960872"/>
-      <w:bookmarkStart w:id="43" w:name="_Toc221960884"/>
+      <w:bookmarkStart w:id="42" w:name="_Toc223036697"/>
+      <w:bookmarkStart w:id="43" w:name="_Toc223036709"/>
       <w:r>
         <w:t>Change log</w:t>
       </w:r>
@@ -13009,8 +12970,8 @@
       <w:pPr>
         <w:pStyle w:val="ParListHeadingms"/>
       </w:pPr>
-      <w:bookmarkStart w:id="49" w:name="_Toc221960873"/>
-      <w:bookmarkStart w:id="50" w:name="_Toc221960885"/>
+      <w:bookmarkStart w:id="49" w:name="_Toc223036698"/>
+      <w:bookmarkStart w:id="50" w:name="_Toc223036710"/>
       <w:r>
         <w:t>List of Content</w:t>
       </w:r>
@@ -13095,7 +13056,7 @@
         </w:rPr>
         <w:fldChar w:fldCharType="separate"/>
       </w:r>
-      <w:hyperlink w:anchor="_Toc221960875" w:history="1">
+      <w:hyperlink w:anchor="_Toc223036700" w:history="1">
         <w:r>
           <w:rPr>
             <w:rStyle w:val="Hyperlink"/>
@@ -13122,7 +13083,7 @@
             <w:noProof/>
             <w:webHidden/>
           </w:rPr>
-          <w:instrText xml:space="preserve"> PAGEREF _Toc221960875 \h </w:instrText>
+          <w:instrText xml:space="preserve"> PAGEREF _Toc223036700 \h </w:instrText>
         </w:r>
         <w:r>
           <w:rPr>
@@ -13168,7 +13129,7 @@
           <w:lang w:val="pl-PL" w:eastAsia="pl-PL"/>
         </w:rPr>
       </w:pPr>
-      <w:hyperlink w:anchor="_Toc221960876" w:history="1">
+      <w:hyperlink w:anchor="_Toc223036701" w:history="1">
         <w:r>
           <w:rPr>
             <w:rStyle w:val="Hyperlink"/>
@@ -13195,7 +13156,7 @@
             <w:noProof/>
             <w:webHidden/>
           </w:rPr>
-          <w:instrText xml:space="preserve"> PAGEREF _Toc221960876 \h </w:instrText>
+          <w:instrText xml:space="preserve"> PAGEREF _Toc223036701 \h </w:instrText>
         </w:r>
         <w:r>
           <w:rPr>
@@ -13241,7 +13202,7 @@
           <w:lang w:val="pl-PL" w:eastAsia="pl-PL"/>
         </w:rPr>
       </w:pPr>
-      <w:hyperlink w:anchor="_Toc221960877" w:history="1">
+      <w:hyperlink w:anchor="_Toc223036702" w:history="1">
         <w:r>
           <w:rPr>
             <w:rStyle w:val="Hyperlink"/>
@@ -13268,7 +13229,7 @@
             <w:noProof/>
             <w:webHidden/>
           </w:rPr>
-          <w:instrText xml:space="preserve"> PAGEREF _Toc221960877 \h </w:instrText>
+          <w:instrText xml:space="preserve"> PAGEREF _Toc223036702 \h </w:instrText>
         </w:r>
         <w:r>
           <w:rPr>
@@ -13314,7 +13275,7 @@
           <w:lang w:val="pl-PL" w:eastAsia="pl-PL"/>
         </w:rPr>
       </w:pPr>
-      <w:hyperlink w:anchor="_Toc221960878" w:history="1">
+      <w:hyperlink w:anchor="_Toc223036703" w:history="1">
         <w:r>
           <w:rPr>
             <w:rStyle w:val="Hyperlink"/>
@@ -13341,7 +13302,7 @@
             <w:noProof/>
             <w:webHidden/>
           </w:rPr>
-          <w:instrText xml:space="preserve"> PAGEREF _Toc221960878 \h </w:instrText>
+          <w:instrText xml:space="preserve"> PAGEREF _Toc223036703 \h </w:instrText>
         </w:r>
         <w:r>
           <w:rPr>
@@ -13387,7 +13348,7 @@
           <w:lang w:val="pl-PL" w:eastAsia="pl-PL"/>
         </w:rPr>
       </w:pPr>
-      <w:hyperlink w:anchor="_Toc221960879" w:history="1">
+      <w:hyperlink w:anchor="_Toc223036704" w:history="1">
         <w:r>
           <w:rPr>
             <w:rStyle w:val="Hyperlink"/>
@@ -13414,7 +13375,7 @@
             <w:noProof/>
             <w:webHidden/>
           </w:rPr>
-          <w:instrText xml:space="preserve"> PAGEREF _Toc221960879 \h </w:instrText>
+          <w:instrText xml:space="preserve"> PAGEREF _Toc223036704 \h </w:instrText>
         </w:r>
         <w:r>
           <w:rPr>
@@ -13460,7 +13421,7 @@
           <w:lang w:val="pl-PL" w:eastAsia="pl-PL"/>
         </w:rPr>
       </w:pPr>
-      <w:hyperlink w:anchor="_Toc221960880" w:history="1">
+      <w:hyperlink w:anchor="_Toc223036705" w:history="1">
         <w:r>
           <w:rPr>
             <w:rStyle w:val="Hyperlink"/>
@@ -13487,7 +13448,7 @@
             <w:noProof/>
             <w:webHidden/>
           </w:rPr>
-          <w:instrText xml:space="preserve"> PAGEREF _Toc221960880 \h </w:instrText>
+          <w:instrText xml:space="preserve"> PAGEREF _Toc223036705 \h </w:instrText>
         </w:r>
         <w:r>
           <w:rPr>
@@ -13533,7 +13494,7 @@
           <w:lang w:val="pl-PL" w:eastAsia="pl-PL"/>
         </w:rPr>
       </w:pPr>
-      <w:hyperlink w:anchor="_Toc221960881" w:history="1">
+      <w:hyperlink w:anchor="_Toc223036706" w:history="1">
         <w:r>
           <w:rPr>
             <w:rStyle w:val="Hyperlink"/>
@@ -13560,7 +13521,7 @@
             <w:noProof/>
             <w:webHidden/>
           </w:rPr>
-          <w:instrText xml:space="preserve"> PAGEREF _Toc221960881 \h </w:instrText>
+          <w:instrText xml:space="preserve"> PAGEREF _Toc223036706 \h </w:instrText>
         </w:r>
         <w:r>
           <w:rPr>
@@ -13606,7 +13567,7 @@
           <w:lang w:val="pl-PL" w:eastAsia="pl-PL"/>
         </w:rPr>
       </w:pPr>
-      <w:hyperlink w:anchor="_Toc221960882" w:history="1">
+      <w:hyperlink w:anchor="_Toc223036707" w:history="1">
         <w:r>
           <w:rPr>
             <w:rStyle w:val="Hyperlink"/>
@@ -13633,7 +13594,7 @@
             <w:noProof/>
             <w:webHidden/>
           </w:rPr>
-          <w:instrText xml:space="preserve"> PAGEREF _Toc221960882 \h </w:instrText>
+          <w:instrText xml:space="preserve"> PAGEREF _Toc223036707 \h </w:instrText>
         </w:r>
         <w:r>
           <w:rPr>
@@ -13679,7 +13640,7 @@
           <w:lang w:val="pl-PL" w:eastAsia="pl-PL"/>
         </w:rPr>
       </w:pPr>
-      <w:hyperlink w:anchor="_Toc221960883" w:history="1">
+      <w:hyperlink w:anchor="_Toc223036708" w:history="1">
         <w:r>
           <w:rPr>
             <w:rStyle w:val="Hyperlink"/>
@@ -13706,7 +13667,7 @@
             <w:noProof/>
             <w:webHidden/>
           </w:rPr>
-          <w:instrText xml:space="preserve"> PAGEREF _Toc221960883 \h </w:instrText>
+          <w:instrText xml:space="preserve"> PAGEREF _Toc223036708 \h </w:instrText>
         </w:r>
         <w:r>
           <w:rPr>
@@ -13752,7 +13713,7 @@
           <w:lang w:val="pl-PL" w:eastAsia="pl-PL"/>
         </w:rPr>
       </w:pPr>
-      <w:hyperlink w:anchor="_Toc221960884" w:history="1">
+      <w:hyperlink w:anchor="_Toc223036709" w:history="1">
         <w:r>
           <w:rPr>
             <w:rStyle w:val="Hyperlink"/>
@@ -13779,7 +13740,7 @@
             <w:noProof/>
             <w:webHidden/>
           </w:rPr>
-          <w:instrText xml:space="preserve"> PAGEREF _Toc221960884 \h </w:instrText>
+          <w:instrText xml:space="preserve"> PAGEREF _Toc223036709 \h </w:instrText>
         </w:r>
         <w:r>
           <w:rPr>
@@ -13825,7 +13786,7 @@
           <w:lang w:val="pl-PL" w:eastAsia="pl-PL"/>
         </w:rPr>
       </w:pPr>
-      <w:hyperlink w:anchor="_Toc221960885" w:history="1">
+      <w:hyperlink w:anchor="_Toc223036710" w:history="1">
         <w:r>
           <w:rPr>
             <w:rStyle w:val="Hyperlink"/>
@@ -13852,7 +13813,7 @@
             <w:noProof/>
             <w:webHidden/>
           </w:rPr>
-          <w:instrText xml:space="preserve"> PAGEREF _Toc221960885 \h </w:instrText>
+          <w:instrText xml:space="preserve"> PAGEREF _Toc223036710 \h </w:instrText>
         </w:r>
         <w:r>
           <w:rPr>
@@ -13898,7 +13859,7 @@
           <w:lang w:val="pl-PL" w:eastAsia="pl-PL"/>
         </w:rPr>
       </w:pPr>
-      <w:hyperlink w:anchor="_Toc221960886" w:history="1">
+      <w:hyperlink w:anchor="_Toc223036711" w:history="1">
         <w:r>
           <w:rPr>
             <w:rStyle w:val="Hyperlink"/>
@@ -13925,7 +13886,7 @@
             <w:noProof/>
             <w:webHidden/>
           </w:rPr>
-          <w:instrText xml:space="preserve"> PAGEREF _Toc221960886 \h </w:instrText>
+          <w:instrText xml:space="preserve"> PAGEREF _Toc223036711 \h </w:instrText>
         </w:r>
         <w:r>
           <w:rPr>
@@ -14068,8 +14029,8 @@
       <w:pPr>
         <w:pStyle w:val="ParListHeadingms"/>
       </w:pPr>
-      <w:bookmarkStart w:id="51" w:name="_Toc221960874"/>
-      <w:bookmarkStart w:id="52" w:name="_Toc221960886"/>
+      <w:bookmarkStart w:id="51" w:name="_Toc223036699"/>
+      <w:bookmarkStart w:id="52" w:name="_Toc223036711"/>
       <w:r>
         <w:t>Change log</w:t>
       </w:r>
@@ -14467,61 +14428,61 @@
 <wne:tcg xmlns:r="http://schemas.openxmlformats.org/officeDocument/2006/relationships" xmlns:wne="http://schemas.microsoft.com/office/word/2006/wordml">
   <wne:keymaps>
     <wne:keymap wne:kcmPrimary="002D">
-      <wne:macro wne:macroName="PROJECT.TOOLS.CUSTOMIZEDOVERTYPE"/>
+      <wne:macro wne:macroName="MACROS_MS.TOOLS.CUSTOMIZEDOVERTYPE"/>
     </wne:keymap>
     <wne:keymap wne:kcmPrimary="0073">
-      <wne:macro wne:macroName="PROJECT.TOOLS.TOGGLESPECIFICFORMATTING"/>
+      <wne:macro wne:macroName="MACROS_MS.TOOLS.TOGGLESPECIFICFORMATTING"/>
     </wne:keymap>
     <wne:keymap wne:kcmPrimary="0076">
-      <wne:macro wne:macroName="PROJECT.TOOLS.INSERTCROSSREF"/>
+      <wne:macro wne:macroName="MACROS_MS.TOOLS.INSERTCROSSREF"/>
     </wne:keymap>
     <wne:keymap wne:kcmPrimary="0077">
-      <wne:macro wne:macroName="PROJECT.TOOLS.SETLANGUAGETOENGLISHUS"/>
+      <wne:macro wne:macroName="MACROS_MS.TOOLS.SETLANGUAGETOENGLISHUS"/>
     </wne:keymap>
     <wne:keymap wne:kcmPrimary="007B">
-      <wne:macro wne:macroName="PROJECT.TOOLS.CUSTOMIZEDSAVEAS"/>
+      <wne:macro wne:macroName="MACROS_MS.TOOLS.CUSTOMIZEDSAVEAS"/>
     </wne:keymap>
     <wne:keymap wne:kcmPrimary="0242">
-      <wne:macro wne:macroName="PROJECT.STYLESM.TOGGLECHARBOLDSTYLE"/>
+      <wne:macro wne:macroName="MACROS_MS.STYLESM.TOGGLECHARBOLDSTYLE"/>
     </wne:keymap>
     <wne:keymap wne:kcmPrimary="0249">
-      <wne:macro wne:macroName="PROJECT.STYLESM.TOGGLECHARITALICSTYLE"/>
+      <wne:macro wne:macroName="MACROS_MS.STYLESM.TOGGLECHARITALICSTYLE"/>
     </wne:keymap>
     <wne:keymap wne:kcmPrimary="0250">
-      <wne:macro wne:macroName="PROJECT.TOOLS.CUSTOMIZEDPRINTING"/>
+      <wne:macro wne:macroName="MACROS_MS.TOOLS.CUSTOMIZEDPRINTING"/>
     </wne:keymap>
     <wne:keymap wne:kcmPrimary="0253">
-      <wne:macro wne:macroName="PROJECT.SCENARIOS.APPLYDISTANCEBETWEENNUMBERINGANDHEADING"/>
+      <wne:macro wne:macroName="MACROS_MS.SCENARIOS.APPLYDISTANCEBETWEENNUMBERINGANDHEADING"/>
     </wne:keymap>
     <wne:keymap wne:kcmPrimary="0255">
-      <wne:macro wne:macroName="PROJECT.STYLESM.TOGGLECHARUNDERLINESTYLE"/>
+      <wne:macro wne:macroName="MACROS_MS.STYLESM.TOGGLECHARUNDERLINESTYLE"/>
     </wne:keymap>
     <wne:keymap wne:kcmPrimary="0257">
-      <wne:macro wne:macroName="PROJECT.SCENARIOS.UPDATEALLFIELDSANDCLOSEFILE"/>
+      <wne:macro wne:macroName="MACROS_MS.SCENARIOS.UPDATEALLFIELDSANDCLOSEFILE"/>
     </wne:keymap>
     <wne:keymap wne:kcmPrimary="0271">
-      <wne:macro wne:macroName="PROJECT.SCENARIOS.CUSTOMIZEDPRINTPREVIEWANDPRINT"/>
+      <wne:macro wne:macroName="MACROS_MS.SCENARIOS.CUSTOMIZEDPRINTPREVIEWANDPRINT"/>
     </wne:keymap>
     <wne:keymap wne:kcmPrimary="0343">
-      <wne:macro wne:macroName="PROJECT.TOOLS.CUSTOMIZEDCOPYFORMAT"/>
+      <wne:macro wne:macroName="MACROS_MS.TOOLS.CUSTOMIZEDCOPYFORMAT"/>
     </wne:keymap>
     <wne:keymap wne:kcmPrimary="0348">
-      <wne:macro wne:macroName="PROJECT.STYLESM.TOGGLECHARHIDDENSTYLE"/>
+      <wne:macro wne:macroName="MACROS_MS.STYLESM.TOGGLECHARHIDDENSTYLE"/>
     </wne:keymap>
     <wne:keymap wne:kcmPrimary="034B">
-      <wne:macro wne:macroName="PROJECT.STYLESM.TOGGLECHARSOURCECODE"/>
+      <wne:macro wne:macroName="MACROS_MS.STYLESM.TOGGLECHARSOURCECODE"/>
     </wne:keymap>
     <wne:keymap wne:kcmPrimary="034E">
       <wne:acd wne:acdName="acd0"/>
     </wne:keymap>
     <wne:keymap wne:kcmPrimary="0353">
-      <wne:macro wne:macroName="PROJECT.TOOLS.TOGGLEAPPLYSTYLES"/>
+      <wne:macro wne:macroName="MACROS_MS.TOOLS.TOGGLEAPPLYSTYLES"/>
     </wne:keymap>
     <wne:keymap wne:kcmPrimary="0356">
-      <wne:macro wne:macroName="PROJECT.TOOLS.CUSTOMIZEDPASTEFORMAT"/>
+      <wne:macro wne:macroName="MACROS_MS.TOOLS.CUSTOMIZEDPASTEFORMAT"/>
     </wne:keymap>
     <wne:keymap wne:kcmPrimary="0358">
-      <wne:macro wne:macroName="PROJECT.STYLESM.TOGGLECHARCROSSOUTSTYLE"/>
+      <wne:macro wne:macroName="MACROS_MS.STYLESM.TOGGLECHARCROSSOUTSTYLE"/>
     </wne:keymap>
     <wne:keymap wne:kcmPrimary="0442" wne:kcmSecondary="0031">
       <wne:acd wne:acdName="acd13"/>
@@ -14539,13 +14500,13 @@
       <wne:fci wne:fciName="FormatFont" wne:swArg="0000"/>
     </wne:keymap>
     <wne:keymap wne:kcmPrimary="0448" wne:kcmSecondary="004B">
-      <wne:macro wne:macroName="PROJECT.SHORTCUTS.SHOWFORMHOTKEYS"/>
+      <wne:macro wne:macroName="MACROS_MS.SHORTCUTS.SHOWFORMHOTKEYS"/>
     </wne:keymap>
     <wne:keymap wne:kcmPrimary="0448" wne:kcmSecondary="004D">
-      <wne:macro wne:macroName="PROJECT.SHORTCUTS.SHOWFORMHOTMACROS"/>
+      <wne:macro wne:macroName="MACROS_MS.SHORTCUTS.SHOWFORMHOTMACROS"/>
     </wne:keymap>
     <wne:keymap wne:kcmPrimary="0448" wne:kcmSecondary="0053">
-      <wne:macro wne:macroName="PROJECT.SHORTCUTS.SHOWFORMHOTSTRINGS"/>
+      <wne:macro wne:macroName="MACROS_MS.SHORTCUTS.SHOWFORMHOTSTRINGS"/>
     </wne:keymap>
     <wne:keymap wne:kcmPrimary="044C" wne:kcmSecondary="0031">
       <wne:acd wne:acdName="acd12"/>
@@ -14563,7 +14524,7 @@
       <wne:acd wne:acdName="acd10"/>
     </wne:keymap>
     <wne:keymap wne:kcmPrimary="044C" wne:kcmSecondary="0052">
-      <wne:macro wne:macroName="PROJECT.TOOLS.RESTARTLISTNUMBERING"/>
+      <wne:macro wne:macroName="MACROS_MS.TOOLS.RESTARTLISTNUMBERING"/>
     </wne:keymap>
     <wne:keymap wne:kcmPrimary="044C" wne:kcmSecondary="0054">
       <wne:acd wne:acdName="acd11"/>
@@ -14587,19 +14548,19 @@
       <wne:acd wne:acdName="acd9"/>
     </wne:keymap>
     <wne:keymap wne:kcmPrimary="0452" wne:kcmSecondary="0053">
-      <wne:macro wne:macroName="PROJECT.TOOLS.REAPPLYTEMPLATESTYLE"/>
+      <wne:macro wne:macroName="MACROS_MS.TOOLS.REAPPLYTEMPLATESTYLE"/>
     </wne:keymap>
     <wne:keymap wne:kcmPrimary="0471">
-      <wne:macro wne:macroName="PROJECT.TOOLS.JUMPTONEXTLIST"/>
+      <wne:macro wne:macroName="MACROS_MS.TOOLS.JUMPTONEXTLIST"/>
     </wne:keymap>
     <wne:keymap wne:kcmPrimary="0472">
-      <wne:macro wne:macroName="PROJECT.TOOLS.JUMPTONEXTTABLE"/>
+      <wne:macro wne:macroName="MACROS_MS.TOOLS.JUMPTONEXTTABLE"/>
     </wne:keymap>
     <wne:keymap wne:kcmPrimary="0474">
-      <wne:macro wne:macroName="PROJECT.TOOLS.JUMPTONEXTCANVAS"/>
+      <wne:macro wne:macroName="MACROS_MS.TOOLS.JUMPTONEXTCANVAS"/>
     </wne:keymap>
     <wne:keymap wne:kcmPrimary="0478">
-      <wne:macro wne:macroName="PROJECT.TOOLS.CUSTOMIZEDTOGGLEFIELDCODES"/>
+      <wne:macro wne:macroName="MACROS_MS.TOOLS.CUSTOMIZEDTOGGLEFIELDCODES"/>
     </wne:keymap>
     <wne:keymap wne:kcmPrimary="0631">
       <wne:acd wne:acdName="acd1"/>
@@ -14632,7 +14593,7 @@
       <wne:fci wne:fciName="FormatParagraph" wne:swArg="0000"/>
     </wne:keymap>
     <wne:keymap wne:kcmPrimary="06DB">
-      <wne:macro wne:macroName="PROJECT.TOOLS.TOGGLEHEADINGCOLLAPSEEXPAND"/>
+      <wne:macro wne:macroName="MACROS_MS.TOOLS.TOGGLEHEADINGCOLLAPSEEXPAND"/>
     </wne:keymap>
   </wne:keymaps>
   <wne:toolbars>

</xml_diff>

<commit_message>
Finished automatic content generation.
</commit_message>
<xml_diff>
--- a/BuildingBlocks_ConfigurationFile/Files/BB_ms_BB_Content.docx
+++ b/BuildingBlocks_ConfigurationFile/Files/BB_ms_BB_Content.docx
@@ -8860,9 +8860,9 @@
         <w:t xml:space="preserve"> </w:t>
       </w:r>
     </w:p>
-    <w:bookmarkStart w:id="31" w:name="_Toc223713415" w:displacedByCustomXml="next"/>
+    <w:bookmarkStart w:id="31" w:name="_Toc223713447" w:displacedByCustomXml="next"/>
     <w:bookmarkStart w:id="32" w:name="_Toc223713427" w:displacedByCustomXml="next"/>
-    <w:bookmarkStart w:id="33" w:name="_Toc223713447" w:displacedByCustomXml="next"/>
+    <w:bookmarkStart w:id="33" w:name="_Toc223713415" w:displacedByCustomXml="next"/>
     <w:sdt>
       <w:sdtPr>
         <w:rPr>
@@ -9975,29 +9975,68 @@
     </w:p>
     <w:tbl>
       <w:tblPr>
+        <w:tblStyle w:val="TabTablems"/>
         <w:tblW w:w="5000" w:type="pct"/>
-        <w:jc w:val="center"/>
         <w:tblLook w:val="04A0" w:firstRow="1" w:lastRow="0" w:firstColumn="1" w:lastColumn="0" w:noHBand="0" w:noVBand="1"/>
       </w:tblPr>
       <w:tblGrid>
-        <w:gridCol w:w="2287"/>
-        <w:gridCol w:w="2573"/>
-        <w:gridCol w:w="2573"/>
-        <w:gridCol w:w="2547"/>
+        <w:gridCol w:w="2282"/>
+        <w:gridCol w:w="2568"/>
+        <w:gridCol w:w="2568"/>
+        <w:gridCol w:w="2542"/>
       </w:tblGrid>
       <w:tr>
         <w:trPr>
+          <w:cnfStyle w:val="100000000000" w:firstRow="1" w:lastRow="0" w:firstColumn="0" w:lastColumn="0" w:oddVBand="0" w:evenVBand="0" w:oddHBand="0" w:evenHBand="0" w:firstRowFirstColumn="0" w:firstRowLastColumn="0" w:lastRowFirstColumn="0" w:lastRowLastColumn="0"/>
+          <w:cantSplit/>
           <w:trHeight w:val="314"/>
           <w:tblHeader/>
-          <w:jc w:val="center"/>
         </w:trPr>
         <w:tc>
           <w:tcPr>
             <w:tcW w:w="5000" w:type="pct"/>
             <w:gridSpan w:val="4"/>
-            <w:tcBorders>
-              <w:bottom w:val="single" w:sz="4" w:space="0" w:color="FFFFFF" w:themeColor="background1"/>
-            </w:tcBorders>
+            <w:vAlign w:val="center"/>
+          </w:tcPr>
+          <w:p>
+            <w:pPr>
+              <w:pStyle w:val="ParInTablems"/>
+              <w:rPr>
+                <w:rStyle w:val="CharDefaultms"/>
+              </w:rPr>
+            </w:pPr>
+            <w:r>
+              <w:rPr>
+                <w:rStyle w:val="CharDefaultms"/>
+              </w:rPr>
+              <w:fldChar w:fldCharType="begin"/>
+            </w:r>
+            <w:r>
+              <w:rPr>
+                <w:rStyle w:val="CharDefaultms"/>
+              </w:rPr>
+              <w:instrText xml:space="preserve"> DOCPROPERTY  "ms_DocumentCategory" </w:instrText>
+            </w:r>
+            <w:r>
+              <w:rPr>
+                <w:rStyle w:val="CharDefaultms"/>
+              </w:rPr>
+              <w:fldChar w:fldCharType="end"/>
+            </w:r>
+          </w:p>
+        </w:tc>
+      </w:tr>
+      <w:tr>
+        <w:trPr>
+          <w:cnfStyle w:val="000000100000" w:firstRow="0" w:lastRow="0" w:firstColumn="0" w:lastColumn="0" w:oddVBand="0" w:evenVBand="0" w:oddHBand="1" w:evenHBand="0" w:firstRowFirstColumn="0" w:firstRowLastColumn="0" w:lastRowFirstColumn="0" w:lastRowLastColumn="0"/>
+          <w:cantSplit/>
+          <w:trHeight w:val="476"/>
+        </w:trPr>
+        <w:tc>
+          <w:tcPr>
+            <w:tcW w:w="5000" w:type="pct"/>
+            <w:gridSpan w:val="4"/>
+            <w:vAlign w:val="center"/>
           </w:tcPr>
           <w:p>
             <w:pPr>
@@ -10017,7 +10056,55 @@
               <w:rPr>
                 <w:rStyle w:val="CharDefaultms"/>
               </w:rPr>
-              <w:instrText xml:space="preserve"> DOCPROPERTY  "ms_DocumentCategory" </w:instrText>
+              <w:instrText xml:space="preserve"> Docproperty  "ms_DocumentTitle1" </w:instrText>
+            </w:r>
+            <w:r>
+              <w:rPr>
+                <w:rStyle w:val="CharDefaultms"/>
+              </w:rPr>
+              <w:fldChar w:fldCharType="separate"/>
+            </w:r>
+            <w:r>
+              <w:rPr>
+                <w:rStyle w:val="CharDefaultms"/>
+              </w:rPr>
+              <w:t>product / system short name</w:t>
+            </w:r>
+            <w:r>
+              <w:rPr>
+                <w:rStyle w:val="CharDefaultms"/>
+              </w:rPr>
+              <w:fldChar w:fldCharType="end"/>
+            </w:r>
+            <w:r>
+              <w:rPr>
+                <w:rStyle w:val="CharDefaultms"/>
+              </w:rPr>
+              <w:t xml:space="preserve"> </w:t>
+            </w:r>
+            <w:r>
+              <w:rPr>
+                <w:rStyle w:val="CharDefaultms"/>
+              </w:rPr>
+              <w:fldChar w:fldCharType="begin"/>
+            </w:r>
+            <w:r>
+              <w:rPr>
+                <w:rStyle w:val="CharDefaultms"/>
+              </w:rPr>
+              <w:instrText xml:space="preserve"> Docproperty  "ms_DocumentTitle2" </w:instrText>
+            </w:r>
+            <w:r>
+              <w:rPr>
+                <w:rStyle w:val="CharDefaultms"/>
+              </w:rPr>
+              <w:fldChar w:fldCharType="separate"/>
+            </w:r>
+            <w:r>
+              <w:rPr>
+                <w:rStyle w:val="CharDefaultms"/>
+              </w:rPr>
+              <w:t>product / system full name</w:t>
             </w:r>
             <w:r>
               <w:rPr>
@@ -10030,107 +10117,17 @@
       </w:tr>
       <w:tr>
         <w:trPr>
-          <w:trHeight w:val="476"/>
-          <w:jc w:val="center"/>
-        </w:trPr>
-        <w:tc>
-          <w:tcPr>
-            <w:tcW w:w="5000" w:type="pct"/>
-            <w:gridSpan w:val="4"/>
-            <w:tcBorders>
-              <w:top w:val="single" w:sz="4" w:space="0" w:color="FFFFFF" w:themeColor="background1"/>
-              <w:bottom w:val="nil"/>
-            </w:tcBorders>
-            <w:shd w:val="clear" w:color="auto" w:fill="80C1DA"/>
-          </w:tcPr>
-          <w:p>
-            <w:pPr>
-              <w:pStyle w:val="ParInTablems"/>
-              <w:jc w:val="left"/>
-              <w:rPr>
-                <w:rStyle w:val="CharDefaultms"/>
-              </w:rPr>
-            </w:pPr>
-            <w:r>
-              <w:rPr>
-                <w:rStyle w:val="CharDefaultms"/>
-              </w:rPr>
-              <w:fldChar w:fldCharType="begin"/>
-            </w:r>
-            <w:r>
-              <w:rPr>
-                <w:rStyle w:val="CharDefaultms"/>
-              </w:rPr>
-              <w:instrText xml:space="preserve"> Docproperty  "ms_DocumentTitle1" </w:instrText>
-            </w:r>
-            <w:r>
-              <w:rPr>
-                <w:rStyle w:val="CharDefaultms"/>
-              </w:rPr>
-              <w:fldChar w:fldCharType="separate"/>
-            </w:r>
-            <w:r>
-              <w:rPr>
-                <w:rStyle w:val="CharDefaultms"/>
-              </w:rPr>
-              <w:t>product / system short name</w:t>
-            </w:r>
-            <w:r>
-              <w:rPr>
-                <w:rStyle w:val="CharDefaultms"/>
-              </w:rPr>
-              <w:fldChar w:fldCharType="end"/>
-            </w:r>
-            <w:r>
-              <w:rPr>
-                <w:rStyle w:val="CharDefaultms"/>
-              </w:rPr>
-              <w:t xml:space="preserve"> </w:t>
-            </w:r>
-            <w:r>
-              <w:rPr>
-                <w:rStyle w:val="CharDefaultms"/>
-              </w:rPr>
-              <w:fldChar w:fldCharType="begin"/>
-            </w:r>
-            <w:r>
-              <w:rPr>
-                <w:rStyle w:val="CharDefaultms"/>
-              </w:rPr>
-              <w:instrText xml:space="preserve"> Docproperty  "ms_DocumentTitle2" </w:instrText>
-            </w:r>
-            <w:r>
-              <w:rPr>
-                <w:rStyle w:val="CharDefaultms"/>
-              </w:rPr>
-              <w:fldChar w:fldCharType="separate"/>
-            </w:r>
-            <w:r>
-              <w:rPr>
-                <w:rStyle w:val="CharDefaultms"/>
-              </w:rPr>
-              <w:t>product / system full name</w:t>
-            </w:r>
-            <w:r>
-              <w:rPr>
-                <w:rStyle w:val="CharDefaultms"/>
-              </w:rPr>
-              <w:fldChar w:fldCharType="end"/>
-            </w:r>
-          </w:p>
-        </w:tc>
-      </w:tr>
-      <w:tr>
-        <w:trPr>
+          <w:cnfStyle w:val="000000010000" w:firstRow="0" w:lastRow="0" w:firstColumn="0" w:lastColumn="0" w:oddVBand="0" w:evenVBand="0" w:oddHBand="0" w:evenHBand="1" w:firstRowFirstColumn="0" w:firstRowLastColumn="0" w:lastRowFirstColumn="0" w:lastRowLastColumn="0"/>
+          <w:cantSplit/>
           <w:trHeight w:val="99"/>
-          <w:jc w:val="center"/>
         </w:trPr>
         <w:tc>
           <w:tcPr>
             <w:tcW w:w="1146" w:type="pct"/>
             <w:tcBorders>
-              <w:bottom w:val="nil"/>
+              <w:bottom w:val="none" w:sz="0" w:space="0" w:color="auto"/>
             </w:tcBorders>
+            <w:vAlign w:val="center"/>
           </w:tcPr>
           <w:p>
             <w:pPr>
@@ -10153,8 +10150,9 @@
             <w:tcW w:w="3854" w:type="pct"/>
             <w:gridSpan w:val="3"/>
             <w:tcBorders>
-              <w:bottom w:val="nil"/>
+              <w:bottom w:val="none" w:sz="0" w:space="0" w:color="auto"/>
             </w:tcBorders>
+            <w:vAlign w:val="center"/>
           </w:tcPr>
           <w:p>
             <w:pPr>
@@ -10200,16 +10198,15 @@
       </w:tr>
       <w:tr>
         <w:trPr>
-          <w:jc w:val="center"/>
+          <w:cnfStyle w:val="000000100000" w:firstRow="0" w:lastRow="0" w:firstColumn="0" w:lastColumn="0" w:oddVBand="0" w:evenVBand="0" w:oddHBand="1" w:evenHBand="0" w:firstRowFirstColumn="0" w:firstRowLastColumn="0" w:lastRowFirstColumn="0" w:lastRowLastColumn="0"/>
+          <w:cantSplit/>
           <w:hidden/>
         </w:trPr>
         <w:tc>
           <w:tcPr>
             <w:tcW w:w="1146" w:type="pct"/>
-            <w:tcBorders>
-              <w:bottom w:val="single" w:sz="4" w:space="0" w:color="FFFFFF" w:themeColor="background1"/>
-            </w:tcBorders>
-            <w:shd w:val="clear" w:color="000000" w:fill="F6C0C0"/>
+            <w:shd w:val="clear" w:color="auto" w:fill="F6C0C0"/>
+            <w:vAlign w:val="center"/>
           </w:tcPr>
           <w:p>
             <w:pPr>
@@ -10230,15 +10227,12 @@
         <w:tc>
           <w:tcPr>
             <w:tcW w:w="1289" w:type="pct"/>
-            <w:tcBorders>
-              <w:bottom w:val="single" w:sz="4" w:space="0" w:color="FFFFFF" w:themeColor="background1"/>
-            </w:tcBorders>
-            <w:shd w:val="clear" w:color="000000" w:fill="F6C0C0"/>
+            <w:shd w:val="clear" w:color="auto" w:fill="F6C0C0"/>
+            <w:vAlign w:val="center"/>
           </w:tcPr>
           <w:p>
             <w:pPr>
               <w:pStyle w:val="ParInTablems"/>
-              <w:jc w:val="left"/>
               <w:rPr>
                 <w:rStyle w:val="CharHiddenms"/>
               </w:rPr>
@@ -10278,15 +10272,12 @@
         <w:tc>
           <w:tcPr>
             <w:tcW w:w="1289" w:type="pct"/>
-            <w:tcBorders>
-              <w:bottom w:val="single" w:sz="4" w:space="0" w:color="FFFFFF" w:themeColor="background1"/>
-            </w:tcBorders>
-            <w:shd w:val="clear" w:color="000000" w:fill="F6C0C0"/>
+            <w:shd w:val="clear" w:color="auto" w:fill="F6C0C0"/>
+            <w:vAlign w:val="center"/>
           </w:tcPr>
           <w:p>
             <w:pPr>
               <w:pStyle w:val="ParInTablems"/>
-              <w:jc w:val="left"/>
               <w:rPr>
                 <w:rStyle w:val="CharHiddenms"/>
               </w:rPr>
@@ -10332,10 +10323,8 @@
         <w:tc>
           <w:tcPr>
             <w:tcW w:w="1276" w:type="pct"/>
-            <w:tcBorders>
-              <w:bottom w:val="single" w:sz="4" w:space="0" w:color="FFFFFF" w:themeColor="background1"/>
-            </w:tcBorders>
-            <w:shd w:val="clear" w:color="000000" w:fill="F6C0C0"/>
+            <w:shd w:val="clear" w:color="auto" w:fill="F6C0C0"/>
+            <w:vAlign w:val="center"/>
           </w:tcPr>
           <w:p>
             <w:pPr>
@@ -10349,17 +10338,14 @@
       </w:tr>
       <w:tr>
         <w:trPr>
-          <w:jc w:val="center"/>
+          <w:cnfStyle w:val="000000010000" w:firstRow="0" w:lastRow="0" w:firstColumn="0" w:lastColumn="0" w:oddVBand="0" w:evenVBand="0" w:oddHBand="0" w:evenHBand="1" w:firstRowFirstColumn="0" w:firstRowLastColumn="0" w:lastRowFirstColumn="0" w:lastRowLastColumn="0"/>
+          <w:cantSplit/>
         </w:trPr>
         <w:tc>
           <w:tcPr>
             <w:tcW w:w="5000" w:type="pct"/>
             <w:gridSpan w:val="4"/>
-            <w:tcBorders>
-              <w:top w:val="single" w:sz="4" w:space="0" w:color="FFFFFF" w:themeColor="background1"/>
-              <w:bottom w:val="single" w:sz="4" w:space="0" w:color="FFFFFF" w:themeColor="background1"/>
-            </w:tcBorders>
-            <w:shd w:val="clear" w:color="auto" w:fill="80C1DA"/>
+            <w:vAlign w:val="center"/>
           </w:tcPr>
           <w:p>
             <w:pPr>
@@ -10374,17 +10360,14 @@
       </w:tr>
       <w:tr>
         <w:trPr>
+          <w:cnfStyle w:val="000000100000" w:firstRow="0" w:lastRow="0" w:firstColumn="0" w:lastColumn="0" w:oddVBand="0" w:evenVBand="0" w:oddHBand="1" w:evenHBand="0" w:firstRowFirstColumn="0" w:firstRowLastColumn="0" w:lastRowFirstColumn="0" w:lastRowLastColumn="0"/>
+          <w:cantSplit/>
           <w:trHeight w:val="454"/>
-          <w:jc w:val="center"/>
         </w:trPr>
         <w:tc>
           <w:tcPr>
             <w:tcW w:w="1146" w:type="pct"/>
-            <w:tcBorders>
-              <w:top w:val="single" w:sz="4" w:space="0" w:color="FFFFFF" w:themeColor="background1"/>
-              <w:bottom w:val="nil"/>
-            </w:tcBorders>
-            <w:shd w:val="clear" w:color="auto" w:fill="E1F6FF"/>
+            <w:vAlign w:val="center"/>
           </w:tcPr>
           <w:p>
             <w:pPr>
@@ -10399,12 +10382,7 @@
         <w:tc>
           <w:tcPr>
             <w:tcW w:w="1289" w:type="pct"/>
-            <w:tcBorders>
-              <w:top w:val="single" w:sz="4" w:space="0" w:color="FFFFFF" w:themeColor="background1"/>
-              <w:bottom w:val="nil"/>
-              <w:right w:val="nil"/>
-            </w:tcBorders>
-            <w:shd w:val="clear" w:color="auto" w:fill="E1F6FF"/>
+            <w:vAlign w:val="center"/>
           </w:tcPr>
           <w:p>
             <w:pPr>
@@ -10415,13 +10393,7 @@
         <w:tc>
           <w:tcPr>
             <w:tcW w:w="1289" w:type="pct"/>
-            <w:tcBorders>
-              <w:top w:val="single" w:sz="4" w:space="0" w:color="FFFFFF" w:themeColor="background1"/>
-              <w:left w:val="nil"/>
-              <w:bottom w:val="nil"/>
-              <w:right w:val="nil"/>
-            </w:tcBorders>
-            <w:shd w:val="clear" w:color="auto" w:fill="E1F6FF"/>
+            <w:vAlign w:val="center"/>
           </w:tcPr>
           <w:p>
             <w:pPr>
@@ -10432,12 +10404,7 @@
         <w:tc>
           <w:tcPr>
             <w:tcW w:w="1276" w:type="pct"/>
-            <w:tcBorders>
-              <w:top w:val="single" w:sz="4" w:space="0" w:color="FFFFFF" w:themeColor="background1"/>
-              <w:left w:val="nil"/>
-              <w:bottom w:val="nil"/>
-            </w:tcBorders>
-            <w:shd w:val="clear" w:color="auto" w:fill="E1F6FF"/>
+            <w:vAlign w:val="center"/>
           </w:tcPr>
           <w:p>
             <w:pPr>
@@ -10448,17 +10415,19 @@
       </w:tr>
       <w:tr>
         <w:trPr>
+          <w:cnfStyle w:val="000000010000" w:firstRow="0" w:lastRow="0" w:firstColumn="0" w:lastColumn="0" w:oddVBand="0" w:evenVBand="0" w:oddHBand="0" w:evenHBand="1" w:firstRowFirstColumn="0" w:firstRowLastColumn="0" w:lastRowFirstColumn="0" w:lastRowLastColumn="0"/>
+          <w:cantSplit/>
           <w:trHeight w:val="454"/>
-          <w:jc w:val="center"/>
           <w:hidden/>
         </w:trPr>
         <w:tc>
           <w:tcPr>
             <w:tcW w:w="1146" w:type="pct"/>
             <w:tcBorders>
-              <w:bottom w:val="nil"/>
+              <w:top w:val="single" w:sz="8" w:space="0" w:color="auto"/>
             </w:tcBorders>
             <w:shd w:val="clear" w:color="000000" w:fill="F6C0C0"/>
+            <w:vAlign w:val="center"/>
           </w:tcPr>
           <w:p>
             <w:pPr>
@@ -10480,10 +10449,10 @@
           <w:tcPr>
             <w:tcW w:w="1289" w:type="pct"/>
             <w:tcBorders>
-              <w:bottom w:val="nil"/>
-              <w:right w:val="nil"/>
+              <w:top w:val="single" w:sz="8" w:space="0" w:color="auto"/>
             </w:tcBorders>
             <w:shd w:val="clear" w:color="000000" w:fill="F6C0C0"/>
+            <w:vAlign w:val="center"/>
           </w:tcPr>
           <w:p>
             <w:pPr>
@@ -10498,11 +10467,10 @@
           <w:tcPr>
             <w:tcW w:w="1289" w:type="pct"/>
             <w:tcBorders>
-              <w:left w:val="nil"/>
-              <w:bottom w:val="nil"/>
-              <w:right w:val="nil"/>
+              <w:top w:val="single" w:sz="8" w:space="0" w:color="auto"/>
             </w:tcBorders>
             <w:shd w:val="clear" w:color="000000" w:fill="F6C0C0"/>
+            <w:vAlign w:val="center"/>
           </w:tcPr>
           <w:p>
             <w:pPr>
@@ -10517,10 +10485,10 @@
           <w:tcPr>
             <w:tcW w:w="1276" w:type="pct"/>
             <w:tcBorders>
-              <w:left w:val="nil"/>
-              <w:bottom w:val="nil"/>
+              <w:top w:val="single" w:sz="8" w:space="0" w:color="auto"/>
             </w:tcBorders>
             <w:shd w:val="clear" w:color="000000" w:fill="F6C0C0"/>
+            <w:vAlign w:val="center"/>
           </w:tcPr>
           <w:p>
             <w:pPr>
@@ -10534,18 +10502,16 @@
       </w:tr>
       <w:tr>
         <w:trPr>
+          <w:cnfStyle w:val="000000100000" w:firstRow="0" w:lastRow="0" w:firstColumn="0" w:lastColumn="0" w:oddVBand="0" w:evenVBand="0" w:oddHBand="1" w:evenHBand="0" w:firstRowFirstColumn="0" w:firstRowLastColumn="0" w:lastRowFirstColumn="0" w:lastRowLastColumn="0"/>
+          <w:cantSplit/>
           <w:trHeight w:val="454"/>
-          <w:jc w:val="center"/>
           <w:hidden/>
         </w:trPr>
         <w:tc>
           <w:tcPr>
             <w:tcW w:w="1146" w:type="pct"/>
-            <w:tcBorders>
-              <w:bottom w:val="nil"/>
-              <w:right w:val="single" w:sz="4" w:space="0" w:color="0082B4"/>
-            </w:tcBorders>
             <w:shd w:val="clear" w:color="000000" w:fill="F6C0C0"/>
+            <w:vAlign w:val="center"/>
           </w:tcPr>
           <w:p>
             <w:pPr>
@@ -10566,12 +10532,8 @@
         <w:tc>
           <w:tcPr>
             <w:tcW w:w="1289" w:type="pct"/>
-            <w:tcBorders>
-              <w:left w:val="single" w:sz="4" w:space="0" w:color="0082B4"/>
-              <w:bottom w:val="nil"/>
-              <w:right w:val="nil"/>
-            </w:tcBorders>
             <w:shd w:val="clear" w:color="000000" w:fill="F6C0C0"/>
+            <w:vAlign w:val="center"/>
           </w:tcPr>
           <w:p>
             <w:pPr>
@@ -10585,12 +10547,8 @@
         <w:tc>
           <w:tcPr>
             <w:tcW w:w="1289" w:type="pct"/>
-            <w:tcBorders>
-              <w:left w:val="nil"/>
-              <w:bottom w:val="nil"/>
-              <w:right w:val="nil"/>
-            </w:tcBorders>
             <w:shd w:val="clear" w:color="000000" w:fill="F6C0C0"/>
+            <w:vAlign w:val="center"/>
           </w:tcPr>
           <w:p>
             <w:pPr>
@@ -10604,11 +10562,8 @@
         <w:tc>
           <w:tcPr>
             <w:tcW w:w="1276" w:type="pct"/>
-            <w:tcBorders>
-              <w:left w:val="nil"/>
-              <w:bottom w:val="nil"/>
-            </w:tcBorders>
             <w:shd w:val="clear" w:color="000000" w:fill="F6C0C0"/>
+            <w:vAlign w:val="center"/>
           </w:tcPr>
           <w:p>
             <w:pPr>
@@ -10622,18 +10577,16 @@
       </w:tr>
       <w:tr>
         <w:trPr>
+          <w:cnfStyle w:val="000000010000" w:firstRow="0" w:lastRow="0" w:firstColumn="0" w:lastColumn="0" w:oddVBand="0" w:evenVBand="0" w:oddHBand="0" w:evenHBand="1" w:firstRowFirstColumn="0" w:firstRowLastColumn="0" w:lastRowFirstColumn="0" w:lastRowLastColumn="0"/>
+          <w:cantSplit/>
           <w:trHeight w:val="454"/>
-          <w:jc w:val="center"/>
           <w:hidden/>
         </w:trPr>
         <w:tc>
           <w:tcPr>
             <w:tcW w:w="1146" w:type="pct"/>
-            <w:tcBorders>
-              <w:bottom w:val="single" w:sz="4" w:space="0" w:color="0082B4"/>
-              <w:right w:val="single" w:sz="4" w:space="0" w:color="0082B4"/>
-            </w:tcBorders>
-            <w:shd w:val="clear" w:color="auto" w:fill="F6C0C0"/>
+            <w:shd w:val="clear" w:color="000000" w:fill="F6C0C0"/>
+            <w:vAlign w:val="center"/>
           </w:tcPr>
           <w:p>
             <w:pPr>
@@ -10655,16 +10608,12 @@
           <w:tcPr>
             <w:tcW w:w="3854" w:type="pct"/>
             <w:gridSpan w:val="3"/>
-            <w:tcBorders>
-              <w:left w:val="single" w:sz="4" w:space="0" w:color="0082B4"/>
-              <w:bottom w:val="single" w:sz="4" w:space="0" w:color="0082B4"/>
-            </w:tcBorders>
-            <w:shd w:val="clear" w:color="auto" w:fill="F6C0C0"/>
+            <w:shd w:val="clear" w:color="000000" w:fill="F6C0C0"/>
+            <w:vAlign w:val="center"/>
           </w:tcPr>
           <w:p>
             <w:pPr>
               <w:pStyle w:val="ParInTablems"/>
-              <w:jc w:val="left"/>
               <w:rPr>
                 <w:rStyle w:val="CharHiddenms"/>
               </w:rPr>
@@ -10690,7 +10639,6 @@
             <w:r>
               <w:rPr>
                 <w:rStyle w:val="CharHiddenms"/>
-                <w:noProof/>
               </w:rPr>
               <w:t>Normal.dotm</w:t>
             </w:r>
@@ -11173,9 +11121,9 @@
       </w:r>
       <w:proofErr w:type="spellEnd"/>
     </w:p>
-    <w:bookmarkStart w:id="37" w:name="_Toc223713417" w:displacedByCustomXml="next"/>
+    <w:bookmarkStart w:id="37" w:name="_Toc223713449" w:displacedByCustomXml="next"/>
     <w:bookmarkStart w:id="38" w:name="_Toc223713429" w:displacedByCustomXml="next"/>
-    <w:bookmarkStart w:id="39" w:name="_Toc223713449" w:displacedByCustomXml="next"/>
+    <w:bookmarkStart w:id="39" w:name="_Toc223713417" w:displacedByCustomXml="next"/>
     <w:sdt>
       <w:sdtPr>
         <w:rPr>
@@ -11190,8 +11138,8 @@
         </w:docPartObj>
       </w:sdtPr>
       <w:sdtContent>
-        <w:bookmarkStart w:id="40" w:name="_Toc194932340" w:displacedByCustomXml="prev"/>
-        <w:bookmarkStart w:id="41" w:name="_Toc194935769" w:displacedByCustomXml="prev"/>
+        <w:bookmarkStart w:id="40" w:name="_Toc194935769" w:displacedByCustomXml="prev"/>
+        <w:bookmarkStart w:id="41" w:name="_Toc194932340" w:displacedByCustomXml="prev"/>
         <w:p>
           <w:pPr>
             <w:pStyle w:val="ParListHeadingms"/>

</xml_diff>